<commit_message>
feat: extract venue names from M1 applications
</commit_message>
<xml_diff>
--- a/docs/templates/m1/core/Core Event Application Template.docx
+++ b/docs/templates/m1/core/Core Event Application Template.docx
@@ -1943,6 +1943,137 @@
                 <w:rtl w:val="0"/>
               </w:rPr>
               <w:t xml:space="preserve"> </w:t>
+            </w:r>
+          </w:p>
+        </w:tc>
+      </w:tr>
+      <w:tr>
+        <w:trPr>
+          <w:cantSplit w:val="0"/>
+          <w:trHeight w:val="1095" w:hRule="atLeast"/>
+          <w:tblHeader w:val="0"/>
+        </w:trPr>
+        <w:tc>
+          <w:tcPr>
+            <w:tcBorders>
+              <w:top w:color="0f5b66" w:space="0" w:sz="8" w:val="single"/>
+              <w:left w:color="0f5b66" w:space="0" w:sz="8" w:val="single"/>
+              <w:bottom w:color="0f5b66" w:space="0" w:sz="8" w:val="single"/>
+              <w:right w:color="0f5b66" w:space="0" w:sz="8" w:val="single"/>
+            </w:tcBorders>
+            <w:shd w:fill="f4f7f8" w:val="clear"/>
+            <w:tcMar>
+              <w:top w:w="80.0" w:type="dxa"/>
+              <w:left w:w="80.0" w:type="dxa"/>
+              <w:bottom w:w="80.0" w:type="dxa"/>
+              <w:right w:w="180.0" w:type="dxa"/>
+            </w:tcMar>
+            <w:vAlign w:val="top"/>
+          </w:tcPr>
+          <w:p>
+            <w:pPr>
+              <w:spacing w:after="40" w:lineRule="auto"/>
+              <w:rPr>
+                <w:b w:val="1"/>
+                <w:bCs w:val="1"/>
+                <w:color w:val="1f2937"/>
+                <w:sz w:val="19"/>
+                <w:szCs w:val="19"/>
+              </w:rPr>
+            </w:pPr>
+            <w:r>
+              <w:rPr>
+                <w:b w:val="1"/>
+                <w:bCs w:val="1"/>
+                <w:color w:val="0f5b66"/>
+                <w:sz w:val="17"/>
+                <w:szCs w:val="17"/>
+                <w:rtl w:val="0"/>
+              </w:rPr>
+              <w:t xml:space="preserve">A06A / VENUE_NAME</w:t>
+              <w:br w:type="textWrapping"/>
+            </w:r>
+            <w:r>
+              <w:rPr>
+                <w:b w:val="1"/>
+                <w:bCs w:val="1"/>
+                <w:color w:val="1f2937"/>
+                <w:sz w:val="19"/>
+                <w:szCs w:val="19"/>
+                <w:rtl w:val="0"/>
+              </w:rPr>
+              <w:t xml:space="preserve">What is the official name of the event venue or site?</w:t>
+            </w:r>
+          </w:p>
+          <w:p>
+            <w:pPr>
+              <w:spacing w:before="40" w:lineRule="auto"/>
+              <w:rPr>
+                <w:b w:val="1"/>
+                <w:bCs w:val="1"/>
+                <w:i w:val="1"/>
+                <w:iCs w:val="1"/>
+                <w:color w:val="6b7280"/>
+                <w:sz w:val="16"/>
+                <w:szCs w:val="16"/>
+              </w:rPr>
+            </w:pPr>
+            <w:r>
+              <w:rPr>
+                <w:b w:val="1"/>
+                <w:bCs w:val="1"/>
+                <w:i w:val="1"/>
+                <w:iCs w:val="1"/>
+                <w:color w:val="6b7280"/>
+                <w:sz w:val="16"/>
+                <w:szCs w:val="16"/>
+                <w:rtl w:val="0"/>
+              </w:rPr>
+              <w:t xml:space="preserve">Response format: Short text</w:t>
+            </w:r>
+          </w:p>
+        </w:tc>
+        <w:tc>
+          <w:tcPr>
+            <w:tcBorders>
+              <w:top w:color="0f5b66" w:space="0" w:sz="8" w:val="single"/>
+              <w:left w:color="0f5b66" w:space="0" w:sz="8" w:val="single"/>
+              <w:bottom w:color="0f5b66" w:space="0" w:sz="8" w:val="single"/>
+              <w:right w:color="0f5b66" w:space="0" w:sz="8" w:val="single"/>
+            </w:tcBorders>
+            <w:shd w:fill="ffffff" w:val="clear"/>
+            <w:tcMar>
+              <w:top w:w="80.0" w:type="dxa"/>
+              <w:left w:w="140.0" w:type="dxa"/>
+              <w:bottom w:w="80.0" w:type="dxa"/>
+              <w:right w:w="80.0" w:type="dxa"/>
+            </w:tcMar>
+            <w:vAlign w:val="top"/>
+          </w:tcPr>
+          <w:p>
+            <w:pPr>
+              <w:rPr>
+                <w:b w:val="1"/>
+                <w:bCs w:val="1"/>
+                <w:i w:val="1"/>
+                <w:iCs w:val="1"/>
+                <w:color w:val="5f6368"/>
+                <w:sz w:val="20"/>
+                <w:szCs w:val="20"/>
+              </w:rPr>
+            </w:pPr>
+            <w:r>
+              <w:rPr>
+                <w:b w:val="1"/>
+                <w:bCs w:val="1"/>
+                <w:i w:val="1"/>
+                <w:iCs w:val="1"/>
+                <w:color w:val="5f6368"/>
+                <w:sz w:val="20"/>
+                <w:szCs w:val="20"/>
+                <w:rtl w:val="0"/>
+              </w:rPr>
+              <w:t xml:space="preserve">[Enter official venue or site name]</w:t>
             </w:r>
           </w:p>
         </w:tc>

</xml_diff>

<commit_message>
feat: expand M1 document extraction and upload formats
</commit_message>
<xml_diff>
--- a/docs/templates/m1/core/Core Event Application Template.docx
+++ b/docs/templates/m1/core/Core Event Application Template.docx
@@ -1262,8 +1262,8 @@
                 <w:szCs w:val="17"/>
                 <w:rtl w:val="0"/>
               </w:rPr>
-              <w:t xml:space="preserve">A04 / EVENT_DATES</w:t>
-              <w:br w:type="textWrapping"/>
+              <w:t>A04 / EVENT_DATES</w:t>
+              <w:br/>
             </w:r>
             <w:r>
               <w:rPr>
@@ -1274,7 +1274,7 @@
                 <w:szCs w:val="19"/>
                 <w:rtl w:val="0"/>
               </w:rPr>
-              <w:t xml:space="preserve">What are the event start and end dates?</w:t>
+              <w:t>Enter the event start and end calendar dates. Complete both dates even for a one-day event.</w:t>
             </w:r>
           </w:p>
           <w:p>
@@ -1301,7 +1301,7 @@
                 <w:szCs w:val="16"/>
                 <w:rtl w:val="0"/>
               </w:rPr>
-              <w:t xml:space="preserve">Response format: Dates in YYYY-MM-DD</w:t>
+              <w:t>Response format: Event start date and event end date in YYYY-MM-DD</w:t>
             </w:r>
           </w:p>
         </w:tc>
@@ -1414,7 +1414,7 @@
                       <w:szCs w:val="17"/>
                       <w:rtl w:val="0"/>
                     </w:rPr>
-                    <w:t xml:space="preserve">Start date</w:t>
+                    <w:t>Event start date</w:t>
                   </w:r>
                 </w:p>
               </w:tc>
@@ -1459,7 +1459,7 @@
                       <w:szCs w:val="18"/>
                       <w:rtl w:val="0"/>
                     </w:rPr>
-                    <w:t xml:space="preserve">[YYYY-MM-DD]</w:t>
+                    <w:t>[YYYY-MM-DD]</w:t>
                   </w:r>
                 </w:p>
               </w:tc>
@@ -1507,7 +1507,7 @@
                       <w:szCs w:val="17"/>
                       <w:rtl w:val="0"/>
                     </w:rPr>
-                    <w:t xml:space="preserve">End date</w:t>
+                    <w:t>Event end date</w:t>
                   </w:r>
                 </w:p>
               </w:tc>
@@ -1552,7 +1552,7 @@
                       <w:szCs w:val="18"/>
                       <w:rtl w:val="0"/>
                     </w:rPr>
-                    <w:t xml:space="preserve">[YYYY-MM-DD]</w:t>
+                    <w:t>[YYYY-MM-DD]</w:t>
                   </w:r>
                 </w:p>
               </w:tc>
@@ -1626,8 +1626,8 @@
                 <w:szCs w:val="17"/>
                 <w:rtl w:val="0"/>
               </w:rPr>
-              <w:t xml:space="preserve">A05 / OPERATING_HOURS</w:t>
-              <w:br w:type="textWrapping"/>
+              <w:t>A05 / OPERATING_HOURS</w:t>
+              <w:br/>
             </w:r>
             <w:r>
               <w:rPr>
@@ -1638,7 +1638,7 @@
                 <w:szCs w:val="19"/>
                 <w:rtl w:val="0"/>
               </w:rPr>
-              <w:t xml:space="preserve">What are the daily operating hours?</w:t>
+              <w:t>Enter the event start and end times for the calendar dates above.</w:t>
             </w:r>
           </w:p>
           <w:p>
@@ -1665,7 +1665,7 @@
                 <w:szCs w:val="16"/>
                 <w:rtl w:val="0"/>
               </w:rPr>
-              <w:t xml:space="preserve">Response format: 24-hour time in HH:MM</w:t>
+              <w:t>Response format: Event start time and event end time in 24-hour HH:MM</w:t>
             </w:r>
           </w:p>
         </w:tc>
@@ -1778,7 +1778,7 @@
                       <w:szCs w:val="17"/>
                       <w:rtl w:val="0"/>
                     </w:rPr>
-                    <w:t xml:space="preserve">Opening time</w:t>
+                    <w:t>Event start time</w:t>
                   </w:r>
                 </w:p>
               </w:tc>
@@ -1823,7 +1823,7 @@
                       <w:szCs w:val="18"/>
                       <w:rtl w:val="0"/>
                     </w:rPr>
-                    <w:t xml:space="preserve">[HH:MM]</w:t>
+                    <w:t>[HH:MM]</w:t>
                   </w:r>
                 </w:p>
               </w:tc>
@@ -1871,7 +1871,7 @@
                       <w:szCs w:val="17"/>
                       <w:rtl w:val="0"/>
                     </w:rPr>
-                    <w:t xml:space="preserve">Closing time</w:t>
+                    <w:t>Event end time</w:t>
                   </w:r>
                 </w:p>
               </w:tc>
@@ -1916,7 +1916,7 @@
                       <w:szCs w:val="18"/>
                       <w:rtl w:val="0"/>
                     </w:rPr>
-                    <w:t xml:space="preserve">[HH:MM]</w:t>
+                    <w:t>[HH:MM]</w:t>
                   </w:r>
                 </w:p>
               </w:tc>
@@ -10209,6 +10209,2530 @@
                 <w:rtl w:val="0"/>
               </w:rPr>
               <w:t xml:space="preserve">DOC-D02_EmergencyEvacuationPlan.pdf</w:t>
+            </w:r>
+          </w:p>
+        </w:tc>
+      </w:tr>
+    </w:tbl>
+    <w:p>
+      <w:pPr>
+        <w:shd w:fill="0f5b66" w:val="clear"/>
+        <w:spacing w:after="80" w:before="200" w:lineRule="auto"/>
+        <w:rPr>
+          <w:b w:val="1"/>
+          <w:bCs w:val="1"/>
+          <w:color w:val="ffffff"/>
+          <w:sz w:val="25"/>
+          <w:szCs w:val="25"/>
+        </w:rPr>
+        <w:pageBreakBefore/>
+      </w:pPr>
+      <w:r>
+        <w:rPr>
+          <w:b w:val="1"/>
+          <w:bCs w:val="1"/>
+          <w:color w:val="ffffff"/>
+          <w:sz w:val="25"/>
+          <w:szCs w:val="25"/>
+          <w:rtl w:val="0"/>
+        </w:rPr>
+        <w:t xml:space="preserve">E. All-Hazards Profile</w:t>
+      </w:r>
+    </w:p>
+    <w:p>
+      <w:pPr>
+        <w:spacing w:after="100" w:before="200" w:lineRule="auto"/>
+        <w:rPr>
+          <w:b w:val="1"/>
+          <w:bCs w:val="1"/>
+          <w:color w:val="4b5563"/>
+          <w:sz w:val="18"/>
+          <w:szCs w:val="18"/>
+        </w:rPr>
+      </w:pPr>
+      <w:r>
+        <w:rPr>
+          <w:b w:val="1"/>
+          <w:bCs w:val="1"/>
+          <w:color w:val="4b5563"/>
+          <w:sz w:val="18"/>
+          <w:szCs w:val="18"/>
+          <w:rtl w:val="0"/>
+        </w:rPr>
+        <w:t xml:space="preserve">Complete every declaration explicitly. These values are used by STERAS for contextual risk assessment and must be reviewed after automatic extraction.</w:t>
+      </w:r>
+    </w:p>
+    <w:tbl>
+      <w:tblPr>
+        <w:tblStyle w:val="Table17"/>
+        <w:tblW w:w="8880.0" w:type="dxa"/>
+        <w:jc w:val="left"/>
+        <w:tblBorders>
+          <w:top w:color="000000" w:space="0" w:sz="0" w:val="nil"/>
+          <w:left w:color="000000" w:space="0" w:sz="0" w:val="nil"/>
+          <w:bottom w:color="000000" w:space="0" w:sz="0" w:val="nil"/>
+          <w:right w:color="000000" w:space="0" w:sz="0" w:val="nil"/>
+          <w:insideH w:color="000000" w:space="0" w:sz="0" w:val="nil"/>
+          <w:insideV w:color="000000" w:space="0" w:sz="0" w:val="nil"/>
+        </w:tblBorders>
+        <w:tblLayout w:type="fixed"/>
+        <w:tblLook w:val="0600"/>
+      </w:tblPr>
+      <w:tblGrid>
+        <w:gridCol w:w="4680"/>
+        <w:gridCol w:w="4200"/>
+        <w:tblGridChange w:id="0">
+          <w:tblGrid>
+            <w:gridCol w:w="4680"/>
+            <w:gridCol w:w="4200"/>
+          </w:tblGrid>
+        </w:tblGridChange>
+      </w:tblGrid>
+      <w:tr>
+        <w:trPr>
+          <w:cantSplit w:val="1"/>
+          <w:trHeight w:val="375" w:hRule="atLeast"/>
+          <w:tblHeader w:val="1"/>
+        </w:trPr>
+        <w:tc>
+          <w:tcPr>
+            <w:tcBorders>
+              <w:top w:color="0f5b66" w:space="0" w:sz="8" w:val="single"/>
+              <w:left w:color="0f5b66" w:space="0" w:sz="8" w:val="single"/>
+              <w:bottom w:color="0f5b66" w:space="0" w:sz="8" w:val="single"/>
+              <w:right w:color="0f5b66" w:space="0" w:sz="8" w:val="single"/>
+            </w:tcBorders>
+            <w:shd w:fill="ddecef" w:val="clear"/>
+            <w:tcMar>
+              <w:top w:w="80.0" w:type="dxa"/>
+              <w:left w:w="80.0" w:type="dxa"/>
+              <w:bottom w:w="80.0" w:type="dxa"/>
+              <w:right w:w="180.0" w:type="dxa"/>
+            </w:tcMar>
+            <w:vAlign w:val="top"/>
+          </w:tcPr>
+          <w:p>
+            <w:pPr>
+              <w:spacing w:before="200" w:lineRule="auto"/>
+              <w:jc w:val="center"/>
+              <w:rPr>
+                <w:b w:val="1"/>
+                <w:bCs w:val="1"/>
+                <w:color w:val="0f3d42"/>
+                <w:sz w:val="19"/>
+                <w:szCs w:val="19"/>
+              </w:rPr>
+            </w:pPr>
+            <w:r>
+              <w:rPr>
+                <w:b w:val="1"/>
+                <w:bCs w:val="1"/>
+                <w:color w:val="0f3d42"/>
+                <w:sz w:val="19"/>
+                <w:szCs w:val="19"/>
+                <w:rtl w:val="0"/>
+              </w:rPr>
+              <w:t xml:space="preserve">Question / Field ID</w:t>
+            </w:r>
+          </w:p>
+        </w:tc>
+        <w:tc>
+          <w:tcPr>
+            <w:tcBorders>
+              <w:top w:color="0f5b66" w:space="0" w:sz="8" w:val="single"/>
+              <w:left w:color="0f5b66" w:space="0" w:sz="8" w:val="single"/>
+              <w:bottom w:color="0f5b66" w:space="0" w:sz="8" w:val="single"/>
+              <w:right w:color="0f5b66" w:space="0" w:sz="8" w:val="single"/>
+            </w:tcBorders>
+            <w:shd w:fill="ddecef" w:val="clear"/>
+            <w:tcMar>
+              <w:top w:w="80.0" w:type="dxa"/>
+              <w:left w:w="140.0" w:type="dxa"/>
+              <w:bottom w:w="80.0" w:type="dxa"/>
+              <w:right w:w="80.0" w:type="dxa"/>
+            </w:tcMar>
+            <w:vAlign w:val="top"/>
+          </w:tcPr>
+          <w:p>
+            <w:pPr>
+              <w:spacing w:before="200" w:lineRule="auto"/>
+              <w:jc w:val="center"/>
+              <w:rPr>
+                <w:b w:val="1"/>
+                <w:bCs w:val="1"/>
+                <w:color w:val="0f3d42"/>
+                <w:sz w:val="19"/>
+                <w:szCs w:val="19"/>
+              </w:rPr>
+            </w:pPr>
+            <w:r>
+              <w:rPr>
+                <w:b w:val="1"/>
+                <w:bCs w:val="1"/>
+                <w:color w:val="0f3d42"/>
+                <w:sz w:val="19"/>
+                <w:szCs w:val="19"/>
+                <w:rtl w:val="0"/>
+              </w:rPr>
+              <w:t xml:space="preserve">Organiser Response</w:t>
+            </w:r>
+          </w:p>
+        </w:tc>
+      </w:tr>
+      <w:tr>
+        <w:trPr>
+          <w:cantSplit w:val="1"/>
+          <w:trHeight w:val="1005" w:hRule="atLeast"/>
+          <w:tblHeader w:val="0"/>
+        </w:trPr>
+        <w:tc>
+          <w:tcPr>
+            <w:tcBorders>
+              <w:top w:color="0f5b66" w:space="0" w:sz="8" w:val="single"/>
+              <w:left w:color="0f5b66" w:space="0" w:sz="8" w:val="single"/>
+              <w:bottom w:color="0f5b66" w:space="0" w:sz="8" w:val="single"/>
+              <w:right w:color="0f5b66" w:space="0" w:sz="8" w:val="single"/>
+            </w:tcBorders>
+            <w:shd w:fill="f4f7f8" w:val="clear"/>
+            <w:tcMar>
+              <w:top w:w="80.0" w:type="dxa"/>
+              <w:left w:w="80.0" w:type="dxa"/>
+              <w:bottom w:w="80.0" w:type="dxa"/>
+              <w:right w:w="180.0" w:type="dxa"/>
+            </w:tcMar>
+            <w:vAlign w:val="top"/>
+          </w:tcPr>
+          <w:p>
+            <w:pPr>
+              <w:spacing w:after="40" w:lineRule="auto"/>
+              <w:rPr>
+                <w:b w:val="1"/>
+                <w:bCs w:val="1"/>
+                <w:color w:val="1f2937"/>
+                <w:sz w:val="19"/>
+                <w:szCs w:val="19"/>
+              </w:rPr>
+            </w:pPr>
+            <w:r>
+              <w:rPr>
+                <w:b w:val="1"/>
+                <w:bCs w:val="1"/>
+                <w:color w:val="0f5b66"/>
+                <w:sz w:val="17"/>
+                <w:szCs w:val="17"/>
+                <w:rtl w:val="0"/>
+              </w:rPr>
+              <w:t>H01 / VULNERABLE_ATTENDEES_PERCENT</w:t>
+              <w:br/>
+            </w:r>
+            <w:r>
+              <w:rPr>
+                <w:b w:val="1"/>
+                <w:bCs w:val="1"/>
+                <w:color w:val="1f2937"/>
+                <w:sz w:val="19"/>
+                <w:szCs w:val="19"/>
+                <w:rtl w:val="0"/>
+              </w:rPr>
+              <w:t>What percentage of attendees may need additional assistance because of age, disability or another vulnerability?</w:t>
+            </w:r>
+          </w:p>
+          <w:p>
+            <w:pPr>
+              <w:spacing w:before="40" w:lineRule="auto"/>
+              <w:rPr>
+                <w:b w:val="1"/>
+                <w:bCs w:val="1"/>
+                <w:i w:val="1"/>
+                <w:iCs w:val="1"/>
+                <w:color w:val="6b7280"/>
+                <w:sz w:val="16"/>
+                <w:szCs w:val="16"/>
+              </w:rPr>
+            </w:pPr>
+            <w:r>
+              <w:rPr>
+                <w:b w:val="1"/>
+                <w:bCs w:val="1"/>
+                <w:i w:val="1"/>
+                <w:iCs w:val="1"/>
+                <w:color w:val="6b7280"/>
+                <w:sz w:val="16"/>
+                <w:szCs w:val="16"/>
+                <w:rtl w:val="0"/>
+              </w:rPr>
+              <w:t>Response format: Whole number from 0 to 100</w:t>
+            </w:r>
+          </w:p>
+        </w:tc>
+        <w:tc>
+          <w:tcPr>
+            <w:tcBorders>
+              <w:top w:color="0f5b66" w:space="0" w:sz="8" w:val="single"/>
+              <w:left w:color="0f5b66" w:space="0" w:sz="8" w:val="single"/>
+              <w:bottom w:color="0f5b66" w:space="0" w:sz="8" w:val="single"/>
+              <w:right w:color="0f5b66" w:space="0" w:sz="8" w:val="single"/>
+            </w:tcBorders>
+            <w:shd w:fill="ffffff" w:val="clear"/>
+            <w:tcMar>
+              <w:top w:w="80.0" w:type="dxa"/>
+              <w:left w:w="140.0" w:type="dxa"/>
+              <w:bottom w:w="80.0" w:type="dxa"/>
+              <w:right w:w="80.0" w:type="dxa"/>
+            </w:tcMar>
+            <w:vAlign w:val="top"/>
+          </w:tcPr>
+          <w:p>
+            <w:pPr>
+              <w:rPr>
+                <w:b w:val="1"/>
+                <w:bCs w:val="1"/>
+                <w:i w:val="1"/>
+                <w:iCs w:val="1"/>
+                <w:color w:val="5f6368"/>
+                <w:sz w:val="20"/>
+                <w:szCs w:val="20"/>
+              </w:rPr>
+            </w:pPr>
+            <w:r>
+              <w:rPr>
+                <w:b w:val="1"/>
+                <w:bCs w:val="1"/>
+                <w:i w:val="1"/>
+                <w:iCs w:val="1"/>
+                <w:color w:val="5f6368"/>
+                <w:sz w:val="20"/>
+                <w:szCs w:val="20"/>
+                <w:rtl w:val="0"/>
+              </w:rPr>
+              <w:t>[Enter percentage from 0 to 100]</w:t>
+            </w:r>
+          </w:p>
+        </w:tc>
+      </w:tr>
+      <w:tr>
+        <w:trPr>
+          <w:cantSplit w:val="1"/>
+          <w:trHeight w:val="1005" w:hRule="atLeast"/>
+          <w:tblHeader w:val="0"/>
+        </w:trPr>
+        <w:tc>
+          <w:tcPr>
+            <w:tcBorders>
+              <w:top w:color="0f5b66" w:space="0" w:sz="8" w:val="single"/>
+              <w:left w:color="0f5b66" w:space="0" w:sz="8" w:val="single"/>
+              <w:bottom w:color="0f5b66" w:space="0" w:sz="8" w:val="single"/>
+              <w:right w:color="0f5b66" w:space="0" w:sz="8" w:val="single"/>
+            </w:tcBorders>
+            <w:shd w:fill="f4f7f8" w:val="clear"/>
+            <w:tcMar>
+              <w:top w:w="80.0" w:type="dxa"/>
+              <w:left w:w="80.0" w:type="dxa"/>
+              <w:bottom w:w="80.0" w:type="dxa"/>
+              <w:right w:w="180.0" w:type="dxa"/>
+            </w:tcMar>
+            <w:vAlign w:val="top"/>
+          </w:tcPr>
+          <w:p>
+            <w:pPr>
+              <w:spacing w:after="40" w:lineRule="auto"/>
+              <w:rPr>
+                <w:b w:val="1"/>
+                <w:bCs w:val="1"/>
+                <w:color w:val="1f2937"/>
+                <w:sz w:val="19"/>
+                <w:szCs w:val="19"/>
+              </w:rPr>
+            </w:pPr>
+            <w:r>
+              <w:rPr>
+                <w:b w:val="1"/>
+                <w:bCs w:val="1"/>
+                <w:color w:val="0f5b66"/>
+                <w:sz w:val="17"/>
+                <w:szCs w:val="17"/>
+                <w:rtl w:val="0"/>
+              </w:rPr>
+              <w:t>H02 / STANDING_ATTENDEES_PERCENT</w:t>
+              <w:br/>
+            </w:r>
+            <w:r>
+              <w:rPr>
+                <w:b w:val="1"/>
+                <w:bCs w:val="1"/>
+                <w:color w:val="1f2937"/>
+                <w:sz w:val="19"/>
+                <w:szCs w:val="19"/>
+                <w:rtl w:val="0"/>
+              </w:rPr>
+              <w:t>What percentage of attendees will be standing rather than seated?</w:t>
+            </w:r>
+          </w:p>
+          <w:p>
+            <w:pPr>
+              <w:spacing w:before="40" w:lineRule="auto"/>
+              <w:rPr>
+                <w:b w:val="1"/>
+                <w:bCs w:val="1"/>
+                <w:i w:val="1"/>
+                <w:iCs w:val="1"/>
+                <w:color w:val="6b7280"/>
+                <w:sz w:val="16"/>
+                <w:szCs w:val="16"/>
+              </w:rPr>
+            </w:pPr>
+            <w:r>
+              <w:rPr>
+                <w:b w:val="1"/>
+                <w:bCs w:val="1"/>
+                <w:i w:val="1"/>
+                <w:iCs w:val="1"/>
+                <w:color w:val="6b7280"/>
+                <w:sz w:val="16"/>
+                <w:szCs w:val="16"/>
+                <w:rtl w:val="0"/>
+              </w:rPr>
+              <w:t>Response format: Whole number from 0 to 100</w:t>
+            </w:r>
+          </w:p>
+        </w:tc>
+        <w:tc>
+          <w:tcPr>
+            <w:tcBorders>
+              <w:top w:color="0f5b66" w:space="0" w:sz="8" w:val="single"/>
+              <w:left w:color="0f5b66" w:space="0" w:sz="8" w:val="single"/>
+              <w:bottom w:color="0f5b66" w:space="0" w:sz="8" w:val="single"/>
+              <w:right w:color="0f5b66" w:space="0" w:sz="8" w:val="single"/>
+            </w:tcBorders>
+            <w:shd w:fill="ffffff" w:val="clear"/>
+            <w:tcMar>
+              <w:top w:w="80.0" w:type="dxa"/>
+              <w:left w:w="140.0" w:type="dxa"/>
+              <w:bottom w:w="80.0" w:type="dxa"/>
+              <w:right w:w="80.0" w:type="dxa"/>
+            </w:tcMar>
+            <w:vAlign w:val="top"/>
+          </w:tcPr>
+          <w:p>
+            <w:pPr>
+              <w:rPr>
+                <w:b w:val="1"/>
+                <w:bCs w:val="1"/>
+                <w:i w:val="1"/>
+                <w:iCs w:val="1"/>
+                <w:color w:val="5f6368"/>
+                <w:sz w:val="20"/>
+                <w:szCs w:val="20"/>
+              </w:rPr>
+            </w:pPr>
+            <w:r>
+              <w:rPr>
+                <w:b w:val="1"/>
+                <w:bCs w:val="1"/>
+                <w:i w:val="1"/>
+                <w:iCs w:val="1"/>
+                <w:color w:val="5f6368"/>
+                <w:sz w:val="20"/>
+                <w:szCs w:val="20"/>
+                <w:rtl w:val="0"/>
+              </w:rPr>
+              <w:t>[Enter percentage from 0 to 100]</w:t>
+            </w:r>
+          </w:p>
+        </w:tc>
+      </w:tr>
+      <w:tr>
+        <w:trPr>
+          <w:cantSplit w:val="1"/>
+          <w:trHeight w:val="1005" w:hRule="atLeast"/>
+          <w:tblHeader w:val="0"/>
+        </w:trPr>
+        <w:tc>
+          <w:tcPr>
+            <w:tcBorders>
+              <w:top w:color="0f5b66" w:space="0" w:sz="8" w:val="single"/>
+              <w:left w:color="0f5b66" w:space="0" w:sz="8" w:val="single"/>
+              <w:bottom w:color="0f5b66" w:space="0" w:sz="8" w:val="single"/>
+              <w:right w:color="0f5b66" w:space="0" w:sz="8" w:val="single"/>
+            </w:tcBorders>
+            <w:shd w:fill="f4f7f8" w:val="clear"/>
+            <w:tcMar>
+              <w:top w:w="80.0" w:type="dxa"/>
+              <w:left w:w="80.0" w:type="dxa"/>
+              <w:bottom w:w="80.0" w:type="dxa"/>
+              <w:right w:w="180.0" w:type="dxa"/>
+            </w:tcMar>
+            <w:vAlign w:val="top"/>
+          </w:tcPr>
+          <w:p>
+            <w:pPr>
+              <w:spacing w:after="40" w:lineRule="auto"/>
+              <w:rPr>
+                <w:b w:val="1"/>
+                <w:bCs w:val="1"/>
+                <w:color w:val="1f2937"/>
+                <w:sz w:val="19"/>
+                <w:szCs w:val="19"/>
+              </w:rPr>
+            </w:pPr>
+            <w:r>
+              <w:rPr>
+                <w:b w:val="1"/>
+                <w:bCs w:val="1"/>
+                <w:color w:val="0f5b66"/>
+                <w:sz w:val="17"/>
+                <w:szCs w:val="17"/>
+                <w:rtl w:val="0"/>
+              </w:rPr>
+              <w:t>H03 / INTERNATIONAL_ATTENDEES</w:t>
+              <w:br/>
+            </w:r>
+            <w:r>
+              <w:rPr>
+                <w:b w:val="1"/>
+                <w:bCs w:val="1"/>
+                <w:color w:val="1f2937"/>
+                <w:sz w:val="19"/>
+                <w:szCs w:val="19"/>
+                <w:rtl w:val="0"/>
+              </w:rPr>
+              <w:t>Are international attendees expected?</w:t>
+            </w:r>
+          </w:p>
+          <w:p>
+            <w:pPr>
+              <w:spacing w:before="40" w:lineRule="auto"/>
+              <w:rPr>
+                <w:b w:val="1"/>
+                <w:bCs w:val="1"/>
+                <w:i w:val="1"/>
+                <w:iCs w:val="1"/>
+                <w:color w:val="6b7280"/>
+                <w:sz w:val="16"/>
+                <w:szCs w:val="16"/>
+              </w:rPr>
+            </w:pPr>
+            <w:r>
+              <w:rPr>
+                <w:b w:val="1"/>
+                <w:bCs w:val="1"/>
+                <w:i w:val="1"/>
+                <w:iCs w:val="1"/>
+                <w:color w:val="6b7280"/>
+                <w:sz w:val="16"/>
+                <w:szCs w:val="16"/>
+                <w:rtl w:val="0"/>
+              </w:rPr>
+              <w:t>Response format: Enter exactly Yes or No</w:t>
+            </w:r>
+          </w:p>
+        </w:tc>
+        <w:tc>
+          <w:tcPr>
+            <w:tcBorders>
+              <w:top w:color="0f5b66" w:space="0" w:sz="8" w:val="single"/>
+              <w:left w:color="0f5b66" w:space="0" w:sz="8" w:val="single"/>
+              <w:bottom w:color="0f5b66" w:space="0" w:sz="8" w:val="single"/>
+              <w:right w:color="0f5b66" w:space="0" w:sz="8" w:val="single"/>
+            </w:tcBorders>
+            <w:shd w:fill="ffffff" w:val="clear"/>
+            <w:tcMar>
+              <w:top w:w="80.0" w:type="dxa"/>
+              <w:left w:w="140.0" w:type="dxa"/>
+              <w:bottom w:w="80.0" w:type="dxa"/>
+              <w:right w:w="80.0" w:type="dxa"/>
+            </w:tcMar>
+            <w:vAlign w:val="top"/>
+          </w:tcPr>
+          <w:p>
+            <w:pPr>
+              <w:rPr>
+                <w:b w:val="1"/>
+                <w:bCs w:val="1"/>
+                <w:i w:val="1"/>
+                <w:iCs w:val="1"/>
+                <w:color w:val="5f6368"/>
+                <w:sz w:val="20"/>
+                <w:szCs w:val="20"/>
+              </w:rPr>
+            </w:pPr>
+            <w:r>
+              <w:rPr>
+                <w:b w:val="1"/>
+                <w:bCs w:val="1"/>
+                <w:i w:val="1"/>
+                <w:iCs w:val="1"/>
+                <w:color w:val="5f6368"/>
+                <w:sz w:val="20"/>
+                <w:szCs w:val="20"/>
+                <w:rtl w:val="0"/>
+              </w:rPr>
+              <w:t>[Yes / No]</w:t>
+            </w:r>
+          </w:p>
+        </w:tc>
+      </w:tr>
+      <w:tr>
+        <w:trPr>
+          <w:cantSplit w:val="1"/>
+          <w:trHeight w:val="1005" w:hRule="atLeast"/>
+          <w:tblHeader w:val="0"/>
+        </w:trPr>
+        <w:tc>
+          <w:tcPr>
+            <w:tcBorders>
+              <w:top w:color="0f5b66" w:space="0" w:sz="8" w:val="single"/>
+              <w:left w:color="0f5b66" w:space="0" w:sz="8" w:val="single"/>
+              <w:bottom w:color="0f5b66" w:space="0" w:sz="8" w:val="single"/>
+              <w:right w:color="0f5b66" w:space="0" w:sz="8" w:val="single"/>
+            </w:tcBorders>
+            <w:shd w:fill="f4f7f8" w:val="clear"/>
+            <w:tcMar>
+              <w:top w:w="80.0" w:type="dxa"/>
+              <w:left w:w="80.0" w:type="dxa"/>
+              <w:bottom w:w="80.0" w:type="dxa"/>
+              <w:right w:w="180.0" w:type="dxa"/>
+            </w:tcMar>
+            <w:vAlign w:val="top"/>
+          </w:tcPr>
+          <w:p>
+            <w:pPr>
+              <w:spacing w:after="40" w:lineRule="auto"/>
+              <w:rPr>
+                <w:b w:val="1"/>
+                <w:bCs w:val="1"/>
+                <w:color w:val="1f2937"/>
+                <w:sz w:val="19"/>
+                <w:szCs w:val="19"/>
+              </w:rPr>
+            </w:pPr>
+            <w:r>
+              <w:rPr>
+                <w:b w:val="1"/>
+                <w:bCs w:val="1"/>
+                <w:color w:val="0f5b66"/>
+                <w:sz w:val="17"/>
+                <w:szCs w:val="17"/>
+                <w:rtl w:val="0"/>
+              </w:rPr>
+              <w:t>H04 / ALCOHOL_SERVED</w:t>
+              <w:br/>
+            </w:r>
+            <w:r>
+              <w:rPr>
+                <w:b w:val="1"/>
+                <w:bCs w:val="1"/>
+                <w:color w:val="1f2937"/>
+                <w:sz w:val="19"/>
+                <w:szCs w:val="19"/>
+                <w:rtl w:val="0"/>
+              </w:rPr>
+              <w:t>Will alcohol be sold, supplied or served?</w:t>
+            </w:r>
+          </w:p>
+          <w:p>
+            <w:pPr>
+              <w:spacing w:before="40" w:lineRule="auto"/>
+              <w:rPr>
+                <w:b w:val="1"/>
+                <w:bCs w:val="1"/>
+                <w:i w:val="1"/>
+                <w:iCs w:val="1"/>
+                <w:color w:val="6b7280"/>
+                <w:sz w:val="16"/>
+                <w:szCs w:val="16"/>
+              </w:rPr>
+            </w:pPr>
+            <w:r>
+              <w:rPr>
+                <w:b w:val="1"/>
+                <w:bCs w:val="1"/>
+                <w:i w:val="1"/>
+                <w:iCs w:val="1"/>
+                <w:color w:val="6b7280"/>
+                <w:sz w:val="16"/>
+                <w:szCs w:val="16"/>
+                <w:rtl w:val="0"/>
+              </w:rPr>
+              <w:t>Response format: Enter exactly Yes or No</w:t>
+            </w:r>
+          </w:p>
+        </w:tc>
+        <w:tc>
+          <w:tcPr>
+            <w:tcBorders>
+              <w:top w:color="0f5b66" w:space="0" w:sz="8" w:val="single"/>
+              <w:left w:color="0f5b66" w:space="0" w:sz="8" w:val="single"/>
+              <w:bottom w:color="0f5b66" w:space="0" w:sz="8" w:val="single"/>
+              <w:right w:color="0f5b66" w:space="0" w:sz="8" w:val="single"/>
+            </w:tcBorders>
+            <w:shd w:fill="ffffff" w:val="clear"/>
+            <w:tcMar>
+              <w:top w:w="80.0" w:type="dxa"/>
+              <w:left w:w="140.0" w:type="dxa"/>
+              <w:bottom w:w="80.0" w:type="dxa"/>
+              <w:right w:w="80.0" w:type="dxa"/>
+            </w:tcMar>
+            <w:vAlign w:val="top"/>
+          </w:tcPr>
+          <w:p>
+            <w:pPr>
+              <w:rPr>
+                <w:b w:val="1"/>
+                <w:bCs w:val="1"/>
+                <w:i w:val="1"/>
+                <w:iCs w:val="1"/>
+                <w:color w:val="5f6368"/>
+                <w:sz w:val="20"/>
+                <w:szCs w:val="20"/>
+              </w:rPr>
+            </w:pPr>
+            <w:r>
+              <w:rPr>
+                <w:b w:val="1"/>
+                <w:bCs w:val="1"/>
+                <w:i w:val="1"/>
+                <w:iCs w:val="1"/>
+                <w:color w:val="5f6368"/>
+                <w:sz w:val="20"/>
+                <w:szCs w:val="20"/>
+                <w:rtl w:val="0"/>
+              </w:rPr>
+              <w:t>[Yes / No]</w:t>
+            </w:r>
+          </w:p>
+        </w:tc>
+      </w:tr>
+      <w:tr>
+        <w:trPr>
+          <w:cantSplit w:val="1"/>
+          <w:trHeight w:val="1005" w:hRule="atLeast"/>
+          <w:tblHeader w:val="0"/>
+        </w:trPr>
+        <w:tc>
+          <w:tcPr>
+            <w:tcBorders>
+              <w:top w:color="0f5b66" w:space="0" w:sz="8" w:val="single"/>
+              <w:left w:color="0f5b66" w:space="0" w:sz="8" w:val="single"/>
+              <w:bottom w:color="0f5b66" w:space="0" w:sz="8" w:val="single"/>
+              <w:right w:color="0f5b66" w:space="0" w:sz="8" w:val="single"/>
+            </w:tcBorders>
+            <w:shd w:fill="f4f7f8" w:val="clear"/>
+            <w:tcMar>
+              <w:top w:w="80.0" w:type="dxa"/>
+              <w:left w:w="80.0" w:type="dxa"/>
+              <w:bottom w:w="80.0" w:type="dxa"/>
+              <w:right w:w="180.0" w:type="dxa"/>
+            </w:tcMar>
+            <w:vAlign w:val="top"/>
+          </w:tcPr>
+          <w:p>
+            <w:pPr>
+              <w:spacing w:after="40" w:lineRule="auto"/>
+              <w:rPr>
+                <w:b w:val="1"/>
+                <w:bCs w:val="1"/>
+                <w:color w:val="1f2937"/>
+                <w:sz w:val="19"/>
+                <w:szCs w:val="19"/>
+              </w:rPr>
+            </w:pPr>
+            <w:r>
+              <w:rPr>
+                <w:b w:val="1"/>
+                <w:bCs w:val="1"/>
+                <w:color w:val="0f5b66"/>
+                <w:sz w:val="17"/>
+                <w:szCs w:val="17"/>
+                <w:rtl w:val="0"/>
+              </w:rPr>
+              <w:t>H05 / FOOD_SERVED</w:t>
+              <w:br/>
+            </w:r>
+            <w:r>
+              <w:rPr>
+                <w:b w:val="1"/>
+                <w:bCs w:val="1"/>
+                <w:color w:val="1f2937"/>
+                <w:sz w:val="19"/>
+                <w:szCs w:val="19"/>
+                <w:rtl w:val="0"/>
+              </w:rPr>
+              <w:t>Will food be prepared, sold or served?</w:t>
+            </w:r>
+          </w:p>
+          <w:p>
+            <w:pPr>
+              <w:spacing w:before="40" w:lineRule="auto"/>
+              <w:rPr>
+                <w:b w:val="1"/>
+                <w:bCs w:val="1"/>
+                <w:i w:val="1"/>
+                <w:iCs w:val="1"/>
+                <w:color w:val="6b7280"/>
+                <w:sz w:val="16"/>
+                <w:szCs w:val="16"/>
+              </w:rPr>
+            </w:pPr>
+            <w:r>
+              <w:rPr>
+                <w:b w:val="1"/>
+                <w:bCs w:val="1"/>
+                <w:i w:val="1"/>
+                <w:iCs w:val="1"/>
+                <w:color w:val="6b7280"/>
+                <w:sz w:val="16"/>
+                <w:szCs w:val="16"/>
+                <w:rtl w:val="0"/>
+              </w:rPr>
+              <w:t>Response format: Enter exactly Yes or No</w:t>
+            </w:r>
+          </w:p>
+        </w:tc>
+        <w:tc>
+          <w:tcPr>
+            <w:tcBorders>
+              <w:top w:color="0f5b66" w:space="0" w:sz="8" w:val="single"/>
+              <w:left w:color="0f5b66" w:space="0" w:sz="8" w:val="single"/>
+              <w:bottom w:color="0f5b66" w:space="0" w:sz="8" w:val="single"/>
+              <w:right w:color="0f5b66" w:space="0" w:sz="8" w:val="single"/>
+            </w:tcBorders>
+            <w:shd w:fill="ffffff" w:val="clear"/>
+            <w:tcMar>
+              <w:top w:w="80.0" w:type="dxa"/>
+              <w:left w:w="140.0" w:type="dxa"/>
+              <w:bottom w:w="80.0" w:type="dxa"/>
+              <w:right w:w="80.0" w:type="dxa"/>
+            </w:tcMar>
+            <w:vAlign w:val="top"/>
+          </w:tcPr>
+          <w:p>
+            <w:pPr>
+              <w:rPr>
+                <w:b w:val="1"/>
+                <w:bCs w:val="1"/>
+                <w:i w:val="1"/>
+                <w:iCs w:val="1"/>
+                <w:color w:val="5f6368"/>
+                <w:sz w:val="20"/>
+                <w:szCs w:val="20"/>
+              </w:rPr>
+            </w:pPr>
+            <w:r>
+              <w:rPr>
+                <w:b w:val="1"/>
+                <w:bCs w:val="1"/>
+                <w:i w:val="1"/>
+                <w:iCs w:val="1"/>
+                <w:color w:val="5f6368"/>
+                <w:sz w:val="20"/>
+                <w:szCs w:val="20"/>
+                <w:rtl w:val="0"/>
+              </w:rPr>
+              <w:t>[Yes / No]</w:t>
+            </w:r>
+          </w:p>
+        </w:tc>
+      </w:tr>
+      <w:tr>
+        <w:trPr>
+          <w:cantSplit w:val="1"/>
+          <w:trHeight w:val="1005" w:hRule="atLeast"/>
+          <w:tblHeader w:val="0"/>
+        </w:trPr>
+        <w:tc>
+          <w:tcPr>
+            <w:tcBorders>
+              <w:top w:color="0f5b66" w:space="0" w:sz="8" w:val="single"/>
+              <w:left w:color="0f5b66" w:space="0" w:sz="8" w:val="single"/>
+              <w:bottom w:color="0f5b66" w:space="0" w:sz="8" w:val="single"/>
+              <w:right w:color="0f5b66" w:space="0" w:sz="8" w:val="single"/>
+            </w:tcBorders>
+            <w:shd w:fill="f4f7f8" w:val="clear"/>
+            <w:tcMar>
+              <w:top w:w="80.0" w:type="dxa"/>
+              <w:left w:w="80.0" w:type="dxa"/>
+              <w:bottom w:w="80.0" w:type="dxa"/>
+              <w:right w:w="180.0" w:type="dxa"/>
+            </w:tcMar>
+            <w:vAlign w:val="top"/>
+          </w:tcPr>
+          <w:p>
+            <w:pPr>
+              <w:spacing w:after="40" w:lineRule="auto"/>
+              <w:rPr>
+                <w:b w:val="1"/>
+                <w:bCs w:val="1"/>
+                <w:color w:val="1f2937"/>
+                <w:sz w:val="19"/>
+                <w:szCs w:val="19"/>
+              </w:rPr>
+            </w:pPr>
+            <w:r>
+              <w:rPr>
+                <w:b w:val="1"/>
+                <w:bCs w:val="1"/>
+                <w:color w:val="0f5b66"/>
+                <w:sz w:val="17"/>
+                <w:szCs w:val="17"/>
+                <w:rtl w:val="0"/>
+              </w:rPr>
+              <w:t>H06 / FREE_DRINKING_WATER</w:t>
+              <w:br/>
+            </w:r>
+            <w:r>
+              <w:rPr>
+                <w:b w:val="1"/>
+                <w:bCs w:val="1"/>
+                <w:color w:val="1f2937"/>
+                <w:sz w:val="19"/>
+                <w:szCs w:val="19"/>
+                <w:rtl w:val="0"/>
+              </w:rPr>
+              <w:t>Will free drinking water be available to attendees?</w:t>
+            </w:r>
+          </w:p>
+          <w:p>
+            <w:pPr>
+              <w:spacing w:before="40" w:lineRule="auto"/>
+              <w:rPr>
+                <w:b w:val="1"/>
+                <w:bCs w:val="1"/>
+                <w:i w:val="1"/>
+                <w:iCs w:val="1"/>
+                <w:color w:val="6b7280"/>
+                <w:sz w:val="16"/>
+                <w:szCs w:val="16"/>
+              </w:rPr>
+            </w:pPr>
+            <w:r>
+              <w:rPr>
+                <w:b w:val="1"/>
+                <w:bCs w:val="1"/>
+                <w:i w:val="1"/>
+                <w:iCs w:val="1"/>
+                <w:color w:val="6b7280"/>
+                <w:sz w:val="16"/>
+                <w:szCs w:val="16"/>
+                <w:rtl w:val="0"/>
+              </w:rPr>
+              <w:t>Response format: Enter exactly Yes or No</w:t>
+            </w:r>
+          </w:p>
+        </w:tc>
+        <w:tc>
+          <w:tcPr>
+            <w:tcBorders>
+              <w:top w:color="0f5b66" w:space="0" w:sz="8" w:val="single"/>
+              <w:left w:color="0f5b66" w:space="0" w:sz="8" w:val="single"/>
+              <w:bottom w:color="0f5b66" w:space="0" w:sz="8" w:val="single"/>
+              <w:right w:color="0f5b66" w:space="0" w:sz="8" w:val="single"/>
+            </w:tcBorders>
+            <w:shd w:fill="ffffff" w:val="clear"/>
+            <w:tcMar>
+              <w:top w:w="80.0" w:type="dxa"/>
+              <w:left w:w="140.0" w:type="dxa"/>
+              <w:bottom w:w="80.0" w:type="dxa"/>
+              <w:right w:w="80.0" w:type="dxa"/>
+            </w:tcMar>
+            <w:vAlign w:val="top"/>
+          </w:tcPr>
+          <w:p>
+            <w:pPr>
+              <w:rPr>
+                <w:b w:val="1"/>
+                <w:bCs w:val="1"/>
+                <w:i w:val="1"/>
+                <w:iCs w:val="1"/>
+                <w:color w:val="5f6368"/>
+                <w:sz w:val="20"/>
+                <w:szCs w:val="20"/>
+              </w:rPr>
+            </w:pPr>
+            <w:r>
+              <w:rPr>
+                <w:b w:val="1"/>
+                <w:bCs w:val="1"/>
+                <w:i w:val="1"/>
+                <w:iCs w:val="1"/>
+                <w:color w:val="5f6368"/>
+                <w:sz w:val="20"/>
+                <w:szCs w:val="20"/>
+                <w:rtl w:val="0"/>
+              </w:rPr>
+              <w:t>[Yes / No]</w:t>
+            </w:r>
+          </w:p>
+        </w:tc>
+      </w:tr>
+      <w:tr>
+        <w:trPr>
+          <w:cantSplit w:val="1"/>
+          <w:trHeight w:val="1005" w:hRule="atLeast"/>
+          <w:tblHeader w:val="0"/>
+        </w:trPr>
+        <w:tc>
+          <w:tcPr>
+            <w:tcBorders>
+              <w:top w:color="0f5b66" w:space="0" w:sz="8" w:val="single"/>
+              <w:left w:color="0f5b66" w:space="0" w:sz="8" w:val="single"/>
+              <w:bottom w:color="0f5b66" w:space="0" w:sz="8" w:val="single"/>
+              <w:right w:color="0f5b66" w:space="0" w:sz="8" w:val="single"/>
+            </w:tcBorders>
+            <w:shd w:fill="f4f7f8" w:val="clear"/>
+            <w:tcMar>
+              <w:top w:w="80.0" w:type="dxa"/>
+              <w:left w:w="80.0" w:type="dxa"/>
+              <w:bottom w:w="80.0" w:type="dxa"/>
+              <w:right w:w="180.0" w:type="dxa"/>
+            </w:tcMar>
+            <w:vAlign w:val="top"/>
+          </w:tcPr>
+          <w:p>
+            <w:pPr>
+              <w:spacing w:after="40" w:lineRule="auto"/>
+              <w:rPr>
+                <w:b w:val="1"/>
+                <w:bCs w:val="1"/>
+                <w:color w:val="1f2937"/>
+                <w:sz w:val="19"/>
+                <w:szCs w:val="19"/>
+              </w:rPr>
+            </w:pPr>
+            <w:r>
+              <w:rPr>
+                <w:b w:val="1"/>
+                <w:bCs w:val="1"/>
+                <w:color w:val="0f5b66"/>
+                <w:sz w:val="17"/>
+                <w:szCs w:val="17"/>
+                <w:rtl w:val="0"/>
+              </w:rPr>
+              <w:t>H07 / TICKETED_ENTRY</w:t>
+              <w:br/>
+            </w:r>
+            <w:r>
+              <w:rPr>
+                <w:b w:val="1"/>
+                <w:bCs w:val="1"/>
+                <w:color w:val="1f2937"/>
+                <w:sz w:val="19"/>
+                <w:szCs w:val="19"/>
+                <w:rtl w:val="0"/>
+              </w:rPr>
+              <w:t>Will entry use tickets or attendee registration?</w:t>
+            </w:r>
+          </w:p>
+          <w:p>
+            <w:pPr>
+              <w:spacing w:before="40" w:lineRule="auto"/>
+              <w:rPr>
+                <w:b w:val="1"/>
+                <w:bCs w:val="1"/>
+                <w:i w:val="1"/>
+                <w:iCs w:val="1"/>
+                <w:color w:val="6b7280"/>
+                <w:sz w:val="16"/>
+                <w:szCs w:val="16"/>
+              </w:rPr>
+            </w:pPr>
+            <w:r>
+              <w:rPr>
+                <w:b w:val="1"/>
+                <w:bCs w:val="1"/>
+                <w:i w:val="1"/>
+                <w:iCs w:val="1"/>
+                <w:color w:val="6b7280"/>
+                <w:sz w:val="16"/>
+                <w:szCs w:val="16"/>
+                <w:rtl w:val="0"/>
+              </w:rPr>
+              <w:t>Response format: Enter exactly Yes or No</w:t>
+            </w:r>
+          </w:p>
+        </w:tc>
+        <w:tc>
+          <w:tcPr>
+            <w:tcBorders>
+              <w:top w:color="0f5b66" w:space="0" w:sz="8" w:val="single"/>
+              <w:left w:color="0f5b66" w:space="0" w:sz="8" w:val="single"/>
+              <w:bottom w:color="0f5b66" w:space="0" w:sz="8" w:val="single"/>
+              <w:right w:color="0f5b66" w:space="0" w:sz="8" w:val="single"/>
+            </w:tcBorders>
+            <w:shd w:fill="ffffff" w:val="clear"/>
+            <w:tcMar>
+              <w:top w:w="80.0" w:type="dxa"/>
+              <w:left w:w="140.0" w:type="dxa"/>
+              <w:bottom w:w="80.0" w:type="dxa"/>
+              <w:right w:w="80.0" w:type="dxa"/>
+            </w:tcMar>
+            <w:vAlign w:val="top"/>
+          </w:tcPr>
+          <w:p>
+            <w:pPr>
+              <w:rPr>
+                <w:b w:val="1"/>
+                <w:bCs w:val="1"/>
+                <w:i w:val="1"/>
+                <w:iCs w:val="1"/>
+                <w:color w:val="5f6368"/>
+                <w:sz w:val="20"/>
+                <w:szCs w:val="20"/>
+              </w:rPr>
+            </w:pPr>
+            <w:r>
+              <w:rPr>
+                <w:b w:val="1"/>
+                <w:bCs w:val="1"/>
+                <w:i w:val="1"/>
+                <w:iCs w:val="1"/>
+                <w:color w:val="5f6368"/>
+                <w:sz w:val="20"/>
+                <w:szCs w:val="20"/>
+                <w:rtl w:val="0"/>
+              </w:rPr>
+              <w:t>[Yes / No]</w:t>
+            </w:r>
+          </w:p>
+        </w:tc>
+      </w:tr>
+      <w:tr>
+        <w:trPr>
+          <w:cantSplit w:val="1"/>
+          <w:trHeight w:val="1005" w:hRule="atLeast"/>
+          <w:tblHeader w:val="0"/>
+        </w:trPr>
+        <w:tc>
+          <w:tcPr>
+            <w:tcBorders>
+              <w:top w:color="0f5b66" w:space="0" w:sz="8" w:val="single"/>
+              <w:left w:color="0f5b66" w:space="0" w:sz="8" w:val="single"/>
+              <w:bottom w:color="0f5b66" w:space="0" w:sz="8" w:val="single"/>
+              <w:right w:color="0f5b66" w:space="0" w:sz="8" w:val="single"/>
+            </w:tcBorders>
+            <w:shd w:fill="f4f7f8" w:val="clear"/>
+            <w:tcMar>
+              <w:top w:w="80.0" w:type="dxa"/>
+              <w:left w:w="80.0" w:type="dxa"/>
+              <w:bottom w:w="80.0" w:type="dxa"/>
+              <w:right w:w="180.0" w:type="dxa"/>
+            </w:tcMar>
+            <w:vAlign w:val="top"/>
+          </w:tcPr>
+          <w:p>
+            <w:pPr>
+              <w:spacing w:after="40" w:lineRule="auto"/>
+              <w:rPr>
+                <w:b w:val="1"/>
+                <w:bCs w:val="1"/>
+                <w:color w:val="1f2937"/>
+                <w:sz w:val="19"/>
+                <w:szCs w:val="19"/>
+              </w:rPr>
+            </w:pPr>
+            <w:r>
+              <w:rPr>
+                <w:b w:val="1"/>
+                <w:bCs w:val="1"/>
+                <w:color w:val="0f5b66"/>
+                <w:sz w:val="17"/>
+                <w:szCs w:val="17"/>
+                <w:rtl w:val="0"/>
+              </w:rPr>
+              <w:t>H08 / OVERNIGHT_ACCOMMODATION</w:t>
+              <w:br/>
+            </w:r>
+            <w:r>
+              <w:rPr>
+                <w:b w:val="1"/>
+                <w:bCs w:val="1"/>
+                <w:color w:val="1f2937"/>
+                <w:sz w:val="19"/>
+                <w:szCs w:val="19"/>
+                <w:rtl w:val="0"/>
+              </w:rPr>
+              <w:t>Does the event include or arrange overnight accommodation?</w:t>
+            </w:r>
+          </w:p>
+          <w:p>
+            <w:pPr>
+              <w:spacing w:before="40" w:lineRule="auto"/>
+              <w:rPr>
+                <w:b w:val="1"/>
+                <w:bCs w:val="1"/>
+                <w:i w:val="1"/>
+                <w:iCs w:val="1"/>
+                <w:color w:val="6b7280"/>
+                <w:sz w:val="16"/>
+                <w:szCs w:val="16"/>
+              </w:rPr>
+            </w:pPr>
+            <w:r>
+              <w:rPr>
+                <w:b w:val="1"/>
+                <w:bCs w:val="1"/>
+                <w:i w:val="1"/>
+                <w:iCs w:val="1"/>
+                <w:color w:val="6b7280"/>
+                <w:sz w:val="16"/>
+                <w:szCs w:val="16"/>
+                <w:rtl w:val="0"/>
+              </w:rPr>
+              <w:t>Response format: Enter exactly Yes or No</w:t>
+            </w:r>
+          </w:p>
+        </w:tc>
+        <w:tc>
+          <w:tcPr>
+            <w:tcBorders>
+              <w:top w:color="0f5b66" w:space="0" w:sz="8" w:val="single"/>
+              <w:left w:color="0f5b66" w:space="0" w:sz="8" w:val="single"/>
+              <w:bottom w:color="0f5b66" w:space="0" w:sz="8" w:val="single"/>
+              <w:right w:color="0f5b66" w:space="0" w:sz="8" w:val="single"/>
+            </w:tcBorders>
+            <w:shd w:fill="ffffff" w:val="clear"/>
+            <w:tcMar>
+              <w:top w:w="80.0" w:type="dxa"/>
+              <w:left w:w="140.0" w:type="dxa"/>
+              <w:bottom w:w="80.0" w:type="dxa"/>
+              <w:right w:w="80.0" w:type="dxa"/>
+            </w:tcMar>
+            <w:vAlign w:val="top"/>
+          </w:tcPr>
+          <w:p>
+            <w:pPr>
+              <w:rPr>
+                <w:b w:val="1"/>
+                <w:bCs w:val="1"/>
+                <w:i w:val="1"/>
+                <w:iCs w:val="1"/>
+                <w:color w:val="5f6368"/>
+                <w:sz w:val="20"/>
+                <w:szCs w:val="20"/>
+              </w:rPr>
+            </w:pPr>
+            <w:r>
+              <w:rPr>
+                <w:b w:val="1"/>
+                <w:bCs w:val="1"/>
+                <w:i w:val="1"/>
+                <w:iCs w:val="1"/>
+                <w:color w:val="5f6368"/>
+                <w:sz w:val="20"/>
+                <w:szCs w:val="20"/>
+                <w:rtl w:val="0"/>
+              </w:rPr>
+              <w:t>[Yes / No]</w:t>
+            </w:r>
+          </w:p>
+        </w:tc>
+      </w:tr>
+      <w:tr>
+        <w:trPr>
+          <w:cantSplit w:val="1"/>
+          <w:trHeight w:val="1005" w:hRule="atLeast"/>
+          <w:tblHeader w:val="0"/>
+        </w:trPr>
+        <w:tc>
+          <w:tcPr>
+            <w:tcBorders>
+              <w:top w:color="0f5b66" w:space="0" w:sz="8" w:val="single"/>
+              <w:left w:color="0f5b66" w:space="0" w:sz="8" w:val="single"/>
+              <w:bottom w:color="0f5b66" w:space="0" w:sz="8" w:val="single"/>
+              <w:right w:color="0f5b66" w:space="0" w:sz="8" w:val="single"/>
+            </w:tcBorders>
+            <w:shd w:fill="f4f7f8" w:val="clear"/>
+            <w:tcMar>
+              <w:top w:w="80.0" w:type="dxa"/>
+              <w:left w:w="80.0" w:type="dxa"/>
+              <w:bottom w:w="80.0" w:type="dxa"/>
+              <w:right w:w="180.0" w:type="dxa"/>
+            </w:tcMar>
+            <w:vAlign w:val="top"/>
+          </w:tcPr>
+          <w:p>
+            <w:pPr>
+              <w:spacing w:after="40" w:lineRule="auto"/>
+              <w:rPr>
+                <w:b w:val="1"/>
+                <w:bCs w:val="1"/>
+                <w:color w:val="1f2937"/>
+                <w:sz w:val="19"/>
+                <w:szCs w:val="19"/>
+              </w:rPr>
+            </w:pPr>
+            <w:r>
+              <w:rPr>
+                <w:b w:val="1"/>
+                <w:bCs w:val="1"/>
+                <w:color w:val="0f5b66"/>
+                <w:sz w:val="17"/>
+                <w:szCs w:val="17"/>
+                <w:rtl w:val="0"/>
+              </w:rPr>
+              <w:t>H09 / PYROTECHNICS</w:t>
+              <w:br/>
+            </w:r>
+            <w:r>
+              <w:rPr>
+                <w:b w:val="1"/>
+                <w:bCs w:val="1"/>
+                <w:color w:val="1f2937"/>
+                <w:sz w:val="19"/>
+                <w:szCs w:val="19"/>
+                <w:rtl w:val="0"/>
+              </w:rPr>
+              <w:t>Will pyrotechnics, fireworks, flame, smoke, lasers or other special effects be used?</w:t>
+            </w:r>
+          </w:p>
+          <w:p>
+            <w:pPr>
+              <w:spacing w:before="40" w:lineRule="auto"/>
+              <w:rPr>
+                <w:b w:val="1"/>
+                <w:bCs w:val="1"/>
+                <w:i w:val="1"/>
+                <w:iCs w:val="1"/>
+                <w:color w:val="6b7280"/>
+                <w:sz w:val="16"/>
+                <w:szCs w:val="16"/>
+              </w:rPr>
+            </w:pPr>
+            <w:r>
+              <w:rPr>
+                <w:b w:val="1"/>
+                <w:bCs w:val="1"/>
+                <w:i w:val="1"/>
+                <w:iCs w:val="1"/>
+                <w:color w:val="6b7280"/>
+                <w:sz w:val="16"/>
+                <w:szCs w:val="16"/>
+                <w:rtl w:val="0"/>
+              </w:rPr>
+              <w:t>Response format: Enter exactly Yes or No</w:t>
+            </w:r>
+          </w:p>
+        </w:tc>
+        <w:tc>
+          <w:tcPr>
+            <w:tcBorders>
+              <w:top w:color="0f5b66" w:space="0" w:sz="8" w:val="single"/>
+              <w:left w:color="0f5b66" w:space="0" w:sz="8" w:val="single"/>
+              <w:bottom w:color="0f5b66" w:space="0" w:sz="8" w:val="single"/>
+              <w:right w:color="0f5b66" w:space="0" w:sz="8" w:val="single"/>
+            </w:tcBorders>
+            <w:shd w:fill="ffffff" w:val="clear"/>
+            <w:tcMar>
+              <w:top w:w="80.0" w:type="dxa"/>
+              <w:left w:w="140.0" w:type="dxa"/>
+              <w:bottom w:w="80.0" w:type="dxa"/>
+              <w:right w:w="80.0" w:type="dxa"/>
+            </w:tcMar>
+            <w:vAlign w:val="top"/>
+          </w:tcPr>
+          <w:p>
+            <w:pPr>
+              <w:rPr>
+                <w:b w:val="1"/>
+                <w:bCs w:val="1"/>
+                <w:i w:val="1"/>
+                <w:iCs w:val="1"/>
+                <w:color w:val="5f6368"/>
+                <w:sz w:val="20"/>
+                <w:szCs w:val="20"/>
+              </w:rPr>
+            </w:pPr>
+            <w:r>
+              <w:rPr>
+                <w:b w:val="1"/>
+                <w:bCs w:val="1"/>
+                <w:i w:val="1"/>
+                <w:iCs w:val="1"/>
+                <w:color w:val="5f6368"/>
+                <w:sz w:val="20"/>
+                <w:szCs w:val="20"/>
+                <w:rtl w:val="0"/>
+              </w:rPr>
+              <w:t>[Yes / No]</w:t>
+            </w:r>
+          </w:p>
+        </w:tc>
+      </w:tr>
+      <w:tr>
+        <w:trPr>
+          <w:cantSplit w:val="1"/>
+          <w:trHeight w:val="1005" w:hRule="atLeast"/>
+          <w:tblHeader w:val="0"/>
+        </w:trPr>
+        <w:tc>
+          <w:tcPr>
+            <w:tcBorders>
+              <w:top w:color="0f5b66" w:space="0" w:sz="8" w:val="single"/>
+              <w:left w:color="0f5b66" w:space="0" w:sz="8" w:val="single"/>
+              <w:bottom w:color="0f5b66" w:space="0" w:sz="8" w:val="single"/>
+              <w:right w:color="0f5b66" w:space="0" w:sz="8" w:val="single"/>
+            </w:tcBorders>
+            <w:shd w:fill="f4f7f8" w:val="clear"/>
+            <w:tcMar>
+              <w:top w:w="80.0" w:type="dxa"/>
+              <w:left w:w="80.0" w:type="dxa"/>
+              <w:bottom w:w="80.0" w:type="dxa"/>
+              <w:right w:w="180.0" w:type="dxa"/>
+            </w:tcMar>
+            <w:vAlign w:val="top"/>
+          </w:tcPr>
+          <w:p>
+            <w:pPr>
+              <w:spacing w:after="40" w:lineRule="auto"/>
+              <w:rPr>
+                <w:b w:val="1"/>
+                <w:bCs w:val="1"/>
+                <w:color w:val="1f2937"/>
+                <w:sz w:val="19"/>
+                <w:szCs w:val="19"/>
+              </w:rPr>
+            </w:pPr>
+            <w:r>
+              <w:rPr>
+                <w:b w:val="1"/>
+                <w:bCs w:val="1"/>
+                <w:color w:val="0f5b66"/>
+                <w:sz w:val="17"/>
+                <w:szCs w:val="17"/>
+                <w:rtl w:val="0"/>
+              </w:rPr>
+              <w:t>H10 / ALL_HAZARDS_TEMPORARY_STRUCTURES</w:t>
+              <w:br/>
+            </w:r>
+            <w:r>
+              <w:rPr>
+                <w:b w:val="1"/>
+                <w:bCs w:val="1"/>
+                <w:color w:val="1f2937"/>
+                <w:sz w:val="19"/>
+                <w:szCs w:val="19"/>
+                <w:rtl w:val="0"/>
+              </w:rPr>
+              <w:t>Will temporary stages, platforms, partitions, trusses, booths or similar structures be installed?</w:t>
+            </w:r>
+          </w:p>
+          <w:p>
+            <w:pPr>
+              <w:spacing w:before="40" w:lineRule="auto"/>
+              <w:rPr>
+                <w:b w:val="1"/>
+                <w:bCs w:val="1"/>
+                <w:i w:val="1"/>
+                <w:iCs w:val="1"/>
+                <w:color w:val="6b7280"/>
+                <w:sz w:val="16"/>
+                <w:szCs w:val="16"/>
+              </w:rPr>
+            </w:pPr>
+            <w:r>
+              <w:rPr>
+                <w:b w:val="1"/>
+                <w:bCs w:val="1"/>
+                <w:i w:val="1"/>
+                <w:iCs w:val="1"/>
+                <w:color w:val="6b7280"/>
+                <w:sz w:val="16"/>
+                <w:szCs w:val="16"/>
+                <w:rtl w:val="0"/>
+              </w:rPr>
+              <w:t>Response format: Enter exactly Yes or No</w:t>
+            </w:r>
+          </w:p>
+        </w:tc>
+        <w:tc>
+          <w:tcPr>
+            <w:tcBorders>
+              <w:top w:color="0f5b66" w:space="0" w:sz="8" w:val="single"/>
+              <w:left w:color="0f5b66" w:space="0" w:sz="8" w:val="single"/>
+              <w:bottom w:color="0f5b66" w:space="0" w:sz="8" w:val="single"/>
+              <w:right w:color="0f5b66" w:space="0" w:sz="8" w:val="single"/>
+            </w:tcBorders>
+            <w:shd w:fill="ffffff" w:val="clear"/>
+            <w:tcMar>
+              <w:top w:w="80.0" w:type="dxa"/>
+              <w:left w:w="140.0" w:type="dxa"/>
+              <w:bottom w:w="80.0" w:type="dxa"/>
+              <w:right w:w="80.0" w:type="dxa"/>
+            </w:tcMar>
+            <w:vAlign w:val="top"/>
+          </w:tcPr>
+          <w:p>
+            <w:pPr>
+              <w:rPr>
+                <w:b w:val="1"/>
+                <w:bCs w:val="1"/>
+                <w:i w:val="1"/>
+                <w:iCs w:val="1"/>
+                <w:color w:val="5f6368"/>
+                <w:sz w:val="20"/>
+                <w:szCs w:val="20"/>
+              </w:rPr>
+            </w:pPr>
+            <w:r>
+              <w:rPr>
+                <w:b w:val="1"/>
+                <w:bCs w:val="1"/>
+                <w:i w:val="1"/>
+                <w:iCs w:val="1"/>
+                <w:color w:val="5f6368"/>
+                <w:sz w:val="20"/>
+                <w:szCs w:val="20"/>
+                <w:rtl w:val="0"/>
+              </w:rPr>
+              <w:t>[Yes / No]</w:t>
+            </w:r>
+          </w:p>
+        </w:tc>
+      </w:tr>
+      <w:tr>
+        <w:trPr>
+          <w:cantSplit w:val="1"/>
+          <w:trHeight w:val="1005" w:hRule="atLeast"/>
+          <w:tblHeader w:val="0"/>
+        </w:trPr>
+        <w:tc>
+          <w:tcPr>
+            <w:tcBorders>
+              <w:top w:color="0f5b66" w:space="0" w:sz="8" w:val="single"/>
+              <w:left w:color="0f5b66" w:space="0" w:sz="8" w:val="single"/>
+              <w:bottom w:color="0f5b66" w:space="0" w:sz="8" w:val="single"/>
+              <w:right w:color="0f5b66" w:space="0" w:sz="8" w:val="single"/>
+            </w:tcBorders>
+            <w:shd w:fill="f4f7f8" w:val="clear"/>
+            <w:tcMar>
+              <w:top w:w="80.0" w:type="dxa"/>
+              <w:left w:w="80.0" w:type="dxa"/>
+              <w:bottom w:w="80.0" w:type="dxa"/>
+              <w:right w:w="180.0" w:type="dxa"/>
+            </w:tcMar>
+            <w:vAlign w:val="top"/>
+          </w:tcPr>
+          <w:p>
+            <w:pPr>
+              <w:spacing w:after="40" w:lineRule="auto"/>
+              <w:rPr>
+                <w:b w:val="1"/>
+                <w:bCs w:val="1"/>
+                <w:color w:val="1f2937"/>
+                <w:sz w:val="19"/>
+                <w:szCs w:val="19"/>
+              </w:rPr>
+            </w:pPr>
+            <w:r>
+              <w:rPr>
+                <w:b w:val="1"/>
+                <w:bCs w:val="1"/>
+                <w:color w:val="0f5b66"/>
+                <w:sz w:val="17"/>
+                <w:szCs w:val="17"/>
+                <w:rtl w:val="0"/>
+              </w:rPr>
+              <w:t>H11 / RIVALRY_OR_TENSION_EXPECTED</w:t>
+              <w:br/>
+            </w:r>
+            <w:r>
+              <w:rPr>
+                <w:b w:val="1"/>
+                <w:bCs w:val="1"/>
+                <w:color w:val="1f2937"/>
+                <w:sz w:val="19"/>
+                <w:szCs w:val="19"/>
+                <w:rtl w:val="0"/>
+              </w:rPr>
+              <w:t>Is rivalry, protest, crowd tension or another foreseeable security concern expected?</w:t>
+            </w:r>
+          </w:p>
+          <w:p>
+            <w:pPr>
+              <w:spacing w:before="40" w:lineRule="auto"/>
+              <w:rPr>
+                <w:b w:val="1"/>
+                <w:bCs w:val="1"/>
+                <w:i w:val="1"/>
+                <w:iCs w:val="1"/>
+                <w:color w:val="6b7280"/>
+                <w:sz w:val="16"/>
+                <w:szCs w:val="16"/>
+              </w:rPr>
+            </w:pPr>
+            <w:r>
+              <w:rPr>
+                <w:b w:val="1"/>
+                <w:bCs w:val="1"/>
+                <w:i w:val="1"/>
+                <w:iCs w:val="1"/>
+                <w:color w:val="6b7280"/>
+                <w:sz w:val="16"/>
+                <w:szCs w:val="16"/>
+                <w:rtl w:val="0"/>
+              </w:rPr>
+              <w:t>Response format: Enter exactly Yes or No</w:t>
+            </w:r>
+          </w:p>
+        </w:tc>
+        <w:tc>
+          <w:tcPr>
+            <w:tcBorders>
+              <w:top w:color="0f5b66" w:space="0" w:sz="8" w:val="single"/>
+              <w:left w:color="0f5b66" w:space="0" w:sz="8" w:val="single"/>
+              <w:bottom w:color="0f5b66" w:space="0" w:sz="8" w:val="single"/>
+              <w:right w:color="0f5b66" w:space="0" w:sz="8" w:val="single"/>
+            </w:tcBorders>
+            <w:shd w:fill="ffffff" w:val="clear"/>
+            <w:tcMar>
+              <w:top w:w="80.0" w:type="dxa"/>
+              <w:left w:w="140.0" w:type="dxa"/>
+              <w:bottom w:w="80.0" w:type="dxa"/>
+              <w:right w:w="80.0" w:type="dxa"/>
+            </w:tcMar>
+            <w:vAlign w:val="top"/>
+          </w:tcPr>
+          <w:p>
+            <w:pPr>
+              <w:rPr>
+                <w:b w:val="1"/>
+                <w:bCs w:val="1"/>
+                <w:i w:val="1"/>
+                <w:iCs w:val="1"/>
+                <w:color w:val="5f6368"/>
+                <w:sz w:val="20"/>
+                <w:szCs w:val="20"/>
+              </w:rPr>
+            </w:pPr>
+            <w:r>
+              <w:rPr>
+                <w:b w:val="1"/>
+                <w:bCs w:val="1"/>
+                <w:i w:val="1"/>
+                <w:iCs w:val="1"/>
+                <w:color w:val="5f6368"/>
+                <w:sz w:val="20"/>
+                <w:szCs w:val="20"/>
+                <w:rtl w:val="0"/>
+              </w:rPr>
+              <w:t>[Yes / No]</w:t>
+            </w:r>
+          </w:p>
+        </w:tc>
+      </w:tr>
+      <w:tr>
+        <w:trPr>
+          <w:cantSplit w:val="1"/>
+          <w:trHeight w:val="1005" w:hRule="atLeast"/>
+          <w:tblHeader w:val="0"/>
+        </w:trPr>
+        <w:tc>
+          <w:tcPr>
+            <w:tcBorders>
+              <w:top w:color="0f5b66" w:space="0" w:sz="8" w:val="single"/>
+              <w:left w:color="0f5b66" w:space="0" w:sz="8" w:val="single"/>
+              <w:bottom w:color="0f5b66" w:space="0" w:sz="8" w:val="single"/>
+              <w:right w:color="0f5b66" w:space="0" w:sz="8" w:val="single"/>
+            </w:tcBorders>
+            <w:shd w:fill="f4f7f8" w:val="clear"/>
+            <w:tcMar>
+              <w:top w:w="80.0" w:type="dxa"/>
+              <w:left w:w="80.0" w:type="dxa"/>
+              <w:bottom w:w="80.0" w:type="dxa"/>
+              <w:right w:w="180.0" w:type="dxa"/>
+            </w:tcMar>
+            <w:vAlign w:val="top"/>
+          </w:tcPr>
+          <w:p>
+            <w:pPr>
+              <w:spacing w:after="40" w:lineRule="auto"/>
+              <w:rPr>
+                <w:b w:val="1"/>
+                <w:bCs w:val="1"/>
+                <w:color w:val="1f2937"/>
+                <w:sz w:val="19"/>
+                <w:szCs w:val="19"/>
+              </w:rPr>
+            </w:pPr>
+            <w:r>
+              <w:rPr>
+                <w:b w:val="1"/>
+                <w:bCs w:val="1"/>
+                <w:color w:val="0f5b66"/>
+                <w:sz w:val="17"/>
+                <w:szCs w:val="17"/>
+                <w:rtl w:val="0"/>
+              </w:rPr>
+              <w:t>H12 / CROWD_MANAGEMENT_PLAN</w:t>
+              <w:br/>
+            </w:r>
+            <w:r>
+              <w:rPr>
+                <w:b w:val="1"/>
+                <w:bCs w:val="1"/>
+                <w:color w:val="1f2937"/>
+                <w:sz w:val="19"/>
+                <w:szCs w:val="19"/>
+                <w:rtl w:val="0"/>
+              </w:rPr>
+              <w:t>Has a crowd-management plan been prepared for this event?</w:t>
+            </w:r>
+          </w:p>
+          <w:p>
+            <w:pPr>
+              <w:spacing w:before="40" w:lineRule="auto"/>
+              <w:rPr>
+                <w:b w:val="1"/>
+                <w:bCs w:val="1"/>
+                <w:i w:val="1"/>
+                <w:iCs w:val="1"/>
+                <w:color w:val="6b7280"/>
+                <w:sz w:val="16"/>
+                <w:szCs w:val="16"/>
+              </w:rPr>
+            </w:pPr>
+            <w:r>
+              <w:rPr>
+                <w:b w:val="1"/>
+                <w:bCs w:val="1"/>
+                <w:i w:val="1"/>
+                <w:iCs w:val="1"/>
+                <w:color w:val="6b7280"/>
+                <w:sz w:val="16"/>
+                <w:szCs w:val="16"/>
+                <w:rtl w:val="0"/>
+              </w:rPr>
+              <w:t>Response format: Enter exactly Yes or No</w:t>
+            </w:r>
+          </w:p>
+        </w:tc>
+        <w:tc>
+          <w:tcPr>
+            <w:tcBorders>
+              <w:top w:color="0f5b66" w:space="0" w:sz="8" w:val="single"/>
+              <w:left w:color="0f5b66" w:space="0" w:sz="8" w:val="single"/>
+              <w:bottom w:color="0f5b66" w:space="0" w:sz="8" w:val="single"/>
+              <w:right w:color="0f5b66" w:space="0" w:sz="8" w:val="single"/>
+            </w:tcBorders>
+            <w:shd w:fill="ffffff" w:val="clear"/>
+            <w:tcMar>
+              <w:top w:w="80.0" w:type="dxa"/>
+              <w:left w:w="140.0" w:type="dxa"/>
+              <w:bottom w:w="80.0" w:type="dxa"/>
+              <w:right w:w="80.0" w:type="dxa"/>
+            </w:tcMar>
+            <w:vAlign w:val="top"/>
+          </w:tcPr>
+          <w:p>
+            <w:pPr>
+              <w:rPr>
+                <w:b w:val="1"/>
+                <w:bCs w:val="1"/>
+                <w:i w:val="1"/>
+                <w:iCs w:val="1"/>
+                <w:color w:val="5f6368"/>
+                <w:sz w:val="20"/>
+                <w:szCs w:val="20"/>
+              </w:rPr>
+            </w:pPr>
+            <w:r>
+              <w:rPr>
+                <w:b w:val="1"/>
+                <w:bCs w:val="1"/>
+                <w:i w:val="1"/>
+                <w:iCs w:val="1"/>
+                <w:color w:val="5f6368"/>
+                <w:sz w:val="20"/>
+                <w:szCs w:val="20"/>
+                <w:rtl w:val="0"/>
+              </w:rPr>
+              <w:t>[Yes / No]</w:t>
+            </w:r>
+          </w:p>
+        </w:tc>
+      </w:tr>
+      <w:tr>
+        <w:trPr>
+          <w:cantSplit w:val="1"/>
+          <w:trHeight w:val="1005" w:hRule="atLeast"/>
+          <w:tblHeader w:val="0"/>
+        </w:trPr>
+        <w:tc>
+          <w:tcPr>
+            <w:tcBorders>
+              <w:top w:color="0f5b66" w:space="0" w:sz="8" w:val="single"/>
+              <w:left w:color="0f5b66" w:space="0" w:sz="8" w:val="single"/>
+              <w:bottom w:color="0f5b66" w:space="0" w:sz="8" w:val="single"/>
+              <w:right w:color="0f5b66" w:space="0" w:sz="8" w:val="single"/>
+            </w:tcBorders>
+            <w:shd w:fill="f4f7f8" w:val="clear"/>
+            <w:tcMar>
+              <w:top w:w="80.0" w:type="dxa"/>
+              <w:left w:w="80.0" w:type="dxa"/>
+              <w:bottom w:w="80.0" w:type="dxa"/>
+              <w:right w:w="180.0" w:type="dxa"/>
+            </w:tcMar>
+            <w:vAlign w:val="top"/>
+          </w:tcPr>
+          <w:p>
+            <w:pPr>
+              <w:spacing w:after="40" w:lineRule="auto"/>
+              <w:rPr>
+                <w:b w:val="1"/>
+                <w:bCs w:val="1"/>
+                <w:color w:val="1f2937"/>
+                <w:sz w:val="19"/>
+                <w:szCs w:val="19"/>
+              </w:rPr>
+            </w:pPr>
+            <w:r>
+              <w:rPr>
+                <w:b w:val="1"/>
+                <w:bCs w:val="1"/>
+                <w:color w:val="0f5b66"/>
+                <w:sz w:val="17"/>
+                <w:szCs w:val="17"/>
+                <w:rtl w:val="0"/>
+              </w:rPr>
+              <w:t>H13 / TRAFFIC_MANAGEMENT_PLAN</w:t>
+              <w:br/>
+            </w:r>
+            <w:r>
+              <w:rPr>
+                <w:b w:val="1"/>
+                <w:bCs w:val="1"/>
+                <w:color w:val="1f2937"/>
+                <w:sz w:val="19"/>
+                <w:szCs w:val="19"/>
+                <w:rtl w:val="0"/>
+              </w:rPr>
+              <w:t>Has a traffic and transport management plan been prepared?</w:t>
+            </w:r>
+          </w:p>
+          <w:p>
+            <w:pPr>
+              <w:spacing w:before="40" w:lineRule="auto"/>
+              <w:rPr>
+                <w:b w:val="1"/>
+                <w:bCs w:val="1"/>
+                <w:i w:val="1"/>
+                <w:iCs w:val="1"/>
+                <w:color w:val="6b7280"/>
+                <w:sz w:val="16"/>
+                <w:szCs w:val="16"/>
+              </w:rPr>
+            </w:pPr>
+            <w:r>
+              <w:rPr>
+                <w:b w:val="1"/>
+                <w:bCs w:val="1"/>
+                <w:i w:val="1"/>
+                <w:iCs w:val="1"/>
+                <w:color w:val="6b7280"/>
+                <w:sz w:val="16"/>
+                <w:szCs w:val="16"/>
+                <w:rtl w:val="0"/>
+              </w:rPr>
+              <w:t>Response format: Enter exactly Yes or No</w:t>
+            </w:r>
+          </w:p>
+        </w:tc>
+        <w:tc>
+          <w:tcPr>
+            <w:tcBorders>
+              <w:top w:color="0f5b66" w:space="0" w:sz="8" w:val="single"/>
+              <w:left w:color="0f5b66" w:space="0" w:sz="8" w:val="single"/>
+              <w:bottom w:color="0f5b66" w:space="0" w:sz="8" w:val="single"/>
+              <w:right w:color="0f5b66" w:space="0" w:sz="8" w:val="single"/>
+            </w:tcBorders>
+            <w:shd w:fill="ffffff" w:val="clear"/>
+            <w:tcMar>
+              <w:top w:w="80.0" w:type="dxa"/>
+              <w:left w:w="140.0" w:type="dxa"/>
+              <w:bottom w:w="80.0" w:type="dxa"/>
+              <w:right w:w="80.0" w:type="dxa"/>
+            </w:tcMar>
+            <w:vAlign w:val="top"/>
+          </w:tcPr>
+          <w:p>
+            <w:pPr>
+              <w:rPr>
+                <w:b w:val="1"/>
+                <w:bCs w:val="1"/>
+                <w:i w:val="1"/>
+                <w:iCs w:val="1"/>
+                <w:color w:val="5f6368"/>
+                <w:sz w:val="20"/>
+                <w:szCs w:val="20"/>
+              </w:rPr>
+            </w:pPr>
+            <w:r>
+              <w:rPr>
+                <w:b w:val="1"/>
+                <w:bCs w:val="1"/>
+                <w:i w:val="1"/>
+                <w:iCs w:val="1"/>
+                <w:color w:val="5f6368"/>
+                <w:sz w:val="20"/>
+                <w:szCs w:val="20"/>
+                <w:rtl w:val="0"/>
+              </w:rPr>
+              <w:t>[Yes / No]</w:t>
+            </w:r>
+          </w:p>
+        </w:tc>
+      </w:tr>
+      <w:tr>
+        <w:trPr>
+          <w:cantSplit w:val="1"/>
+          <w:trHeight w:val="1005" w:hRule="atLeast"/>
+          <w:tblHeader w:val="0"/>
+        </w:trPr>
+        <w:tc>
+          <w:tcPr>
+            <w:tcBorders>
+              <w:top w:color="0f5b66" w:space="0" w:sz="8" w:val="single"/>
+              <w:left w:color="0f5b66" w:space="0" w:sz="8" w:val="single"/>
+              <w:bottom w:color="0f5b66" w:space="0" w:sz="8" w:val="single"/>
+              <w:right w:color="0f5b66" w:space="0" w:sz="8" w:val="single"/>
+            </w:tcBorders>
+            <w:shd w:fill="f4f7f8" w:val="clear"/>
+            <w:tcMar>
+              <w:top w:w="80.0" w:type="dxa"/>
+              <w:left w:w="80.0" w:type="dxa"/>
+              <w:bottom w:w="80.0" w:type="dxa"/>
+              <w:right w:w="180.0" w:type="dxa"/>
+            </w:tcMar>
+            <w:vAlign w:val="top"/>
+          </w:tcPr>
+          <w:p>
+            <w:pPr>
+              <w:spacing w:after="40" w:lineRule="auto"/>
+              <w:rPr>
+                <w:b w:val="1"/>
+                <w:bCs w:val="1"/>
+                <w:color w:val="1f2937"/>
+                <w:sz w:val="19"/>
+                <w:szCs w:val="19"/>
+              </w:rPr>
+            </w:pPr>
+            <w:r>
+              <w:rPr>
+                <w:b w:val="1"/>
+                <w:bCs w:val="1"/>
+                <w:color w:val="0f5b66"/>
+                <w:sz w:val="17"/>
+                <w:szCs w:val="17"/>
+                <w:rtl w:val="0"/>
+              </w:rPr>
+              <w:t>H14 / SEVERE_WEATHER_PLAN</w:t>
+              <w:br/>
+            </w:r>
+            <w:r>
+              <w:rPr>
+                <w:b w:val="1"/>
+                <w:bCs w:val="1"/>
+                <w:color w:val="1f2937"/>
+                <w:sz w:val="19"/>
+                <w:szCs w:val="19"/>
+                <w:rtl w:val="0"/>
+              </w:rPr>
+              <w:t>Has a severe-weather monitoring and response plan been prepared?</w:t>
+            </w:r>
+          </w:p>
+          <w:p>
+            <w:pPr>
+              <w:spacing w:before="40" w:lineRule="auto"/>
+              <w:rPr>
+                <w:b w:val="1"/>
+                <w:bCs w:val="1"/>
+                <w:i w:val="1"/>
+                <w:iCs w:val="1"/>
+                <w:color w:val="6b7280"/>
+                <w:sz w:val="16"/>
+                <w:szCs w:val="16"/>
+              </w:rPr>
+            </w:pPr>
+            <w:r>
+              <w:rPr>
+                <w:b w:val="1"/>
+                <w:bCs w:val="1"/>
+                <w:i w:val="1"/>
+                <w:iCs w:val="1"/>
+                <w:color w:val="6b7280"/>
+                <w:sz w:val="16"/>
+                <w:szCs w:val="16"/>
+                <w:rtl w:val="0"/>
+              </w:rPr>
+              <w:t>Response format: Enter exactly Yes or No</w:t>
+            </w:r>
+          </w:p>
+        </w:tc>
+        <w:tc>
+          <w:tcPr>
+            <w:tcBorders>
+              <w:top w:color="0f5b66" w:space="0" w:sz="8" w:val="single"/>
+              <w:left w:color="0f5b66" w:space="0" w:sz="8" w:val="single"/>
+              <w:bottom w:color="0f5b66" w:space="0" w:sz="8" w:val="single"/>
+              <w:right w:color="0f5b66" w:space="0" w:sz="8" w:val="single"/>
+            </w:tcBorders>
+            <w:shd w:fill="ffffff" w:val="clear"/>
+            <w:tcMar>
+              <w:top w:w="80.0" w:type="dxa"/>
+              <w:left w:w="140.0" w:type="dxa"/>
+              <w:bottom w:w="80.0" w:type="dxa"/>
+              <w:right w:w="80.0" w:type="dxa"/>
+            </w:tcMar>
+            <w:vAlign w:val="top"/>
+          </w:tcPr>
+          <w:p>
+            <w:pPr>
+              <w:rPr>
+                <w:b w:val="1"/>
+                <w:bCs w:val="1"/>
+                <w:i w:val="1"/>
+                <w:iCs w:val="1"/>
+                <w:color w:val="5f6368"/>
+                <w:sz w:val="20"/>
+                <w:szCs w:val="20"/>
+              </w:rPr>
+            </w:pPr>
+            <w:r>
+              <w:rPr>
+                <w:b w:val="1"/>
+                <w:bCs w:val="1"/>
+                <w:i w:val="1"/>
+                <w:iCs w:val="1"/>
+                <w:color w:val="5f6368"/>
+                <w:sz w:val="20"/>
+                <w:szCs w:val="20"/>
+                <w:rtl w:val="0"/>
+              </w:rPr>
+              <w:t>[Yes / No]</w:t>
+            </w:r>
+          </w:p>
+        </w:tc>
+      </w:tr>
+      <w:tr>
+        <w:trPr>
+          <w:cantSplit w:val="1"/>
+          <w:trHeight w:val="1005" w:hRule="atLeast"/>
+          <w:tblHeader w:val="0"/>
+        </w:trPr>
+        <w:tc>
+          <w:tcPr>
+            <w:tcBorders>
+              <w:top w:color="0f5b66" w:space="0" w:sz="8" w:val="single"/>
+              <w:left w:color="0f5b66" w:space="0" w:sz="8" w:val="single"/>
+              <w:bottom w:color="0f5b66" w:space="0" w:sz="8" w:val="single"/>
+              <w:right w:color="0f5b66" w:space="0" w:sz="8" w:val="single"/>
+            </w:tcBorders>
+            <w:shd w:fill="f4f7f8" w:val="clear"/>
+            <w:tcMar>
+              <w:top w:w="80.0" w:type="dxa"/>
+              <w:left w:w="80.0" w:type="dxa"/>
+              <w:bottom w:w="80.0" w:type="dxa"/>
+              <w:right w:w="180.0" w:type="dxa"/>
+            </w:tcMar>
+            <w:vAlign w:val="top"/>
+          </w:tcPr>
+          <w:p>
+            <w:pPr>
+              <w:spacing w:after="40" w:lineRule="auto"/>
+              <w:rPr>
+                <w:b w:val="1"/>
+                <w:bCs w:val="1"/>
+                <w:color w:val="1f2937"/>
+                <w:sz w:val="19"/>
+                <w:szCs w:val="19"/>
+              </w:rPr>
+            </w:pPr>
+            <w:r>
+              <w:rPr>
+                <w:b w:val="1"/>
+                <w:bCs w:val="1"/>
+                <w:color w:val="0f5b66"/>
+                <w:sz w:val="17"/>
+                <w:szCs w:val="17"/>
+                <w:rtl w:val="0"/>
+              </w:rPr>
+              <w:t>H15 / MEDICAL_PLAN</w:t>
+              <w:br/>
+            </w:r>
+            <w:r>
+              <w:rPr>
+                <w:b w:val="1"/>
+                <w:bCs w:val="1"/>
+                <w:color w:val="1f2937"/>
+                <w:sz w:val="19"/>
+                <w:szCs w:val="19"/>
+                <w:rtl w:val="0"/>
+              </w:rPr>
+              <w:t>Has a first-aid and medical response plan been prepared?</w:t>
+            </w:r>
+          </w:p>
+          <w:p>
+            <w:pPr>
+              <w:spacing w:before="40" w:lineRule="auto"/>
+              <w:rPr>
+                <w:b w:val="1"/>
+                <w:bCs w:val="1"/>
+                <w:i w:val="1"/>
+                <w:iCs w:val="1"/>
+                <w:color w:val="6b7280"/>
+                <w:sz w:val="16"/>
+                <w:szCs w:val="16"/>
+              </w:rPr>
+            </w:pPr>
+            <w:r>
+              <w:rPr>
+                <w:b w:val="1"/>
+                <w:bCs w:val="1"/>
+                <w:i w:val="1"/>
+                <w:iCs w:val="1"/>
+                <w:color w:val="6b7280"/>
+                <w:sz w:val="16"/>
+                <w:szCs w:val="16"/>
+                <w:rtl w:val="0"/>
+              </w:rPr>
+              <w:t>Response format: Enter exactly Yes or No</w:t>
+            </w:r>
+          </w:p>
+        </w:tc>
+        <w:tc>
+          <w:tcPr>
+            <w:tcBorders>
+              <w:top w:color="0f5b66" w:space="0" w:sz="8" w:val="single"/>
+              <w:left w:color="0f5b66" w:space="0" w:sz="8" w:val="single"/>
+              <w:bottom w:color="0f5b66" w:space="0" w:sz="8" w:val="single"/>
+              <w:right w:color="0f5b66" w:space="0" w:sz="8" w:val="single"/>
+            </w:tcBorders>
+            <w:shd w:fill="ffffff" w:val="clear"/>
+            <w:tcMar>
+              <w:top w:w="80.0" w:type="dxa"/>
+              <w:left w:w="140.0" w:type="dxa"/>
+              <w:bottom w:w="80.0" w:type="dxa"/>
+              <w:right w:w="80.0" w:type="dxa"/>
+            </w:tcMar>
+            <w:vAlign w:val="top"/>
+          </w:tcPr>
+          <w:p>
+            <w:pPr>
+              <w:rPr>
+                <w:b w:val="1"/>
+                <w:bCs w:val="1"/>
+                <w:i w:val="1"/>
+                <w:iCs w:val="1"/>
+                <w:color w:val="5f6368"/>
+                <w:sz w:val="20"/>
+                <w:szCs w:val="20"/>
+              </w:rPr>
+            </w:pPr>
+            <w:r>
+              <w:rPr>
+                <w:b w:val="1"/>
+                <w:bCs w:val="1"/>
+                <w:i w:val="1"/>
+                <w:iCs w:val="1"/>
+                <w:color w:val="5f6368"/>
+                <w:sz w:val="20"/>
+                <w:szCs w:val="20"/>
+                <w:rtl w:val="0"/>
+              </w:rPr>
+              <w:t>[Yes / No]</w:t>
+            </w:r>
+          </w:p>
+        </w:tc>
+      </w:tr>
+      <w:tr>
+        <w:trPr>
+          <w:cantSplit w:val="1"/>
+          <w:trHeight w:val="1005" w:hRule="atLeast"/>
+          <w:tblHeader w:val="0"/>
+        </w:trPr>
+        <w:tc>
+          <w:tcPr>
+            <w:tcBorders>
+              <w:top w:color="0f5b66" w:space="0" w:sz="8" w:val="single"/>
+              <w:left w:color="0f5b66" w:space="0" w:sz="8" w:val="single"/>
+              <w:bottom w:color="0f5b66" w:space="0" w:sz="8" w:val="single"/>
+              <w:right w:color="0f5b66" w:space="0" w:sz="8" w:val="single"/>
+            </w:tcBorders>
+            <w:shd w:fill="f4f7f8" w:val="clear"/>
+            <w:tcMar>
+              <w:top w:w="80.0" w:type="dxa"/>
+              <w:left w:w="80.0" w:type="dxa"/>
+              <w:bottom w:w="80.0" w:type="dxa"/>
+              <w:right w:w="180.0" w:type="dxa"/>
+            </w:tcMar>
+            <w:vAlign w:val="top"/>
+          </w:tcPr>
+          <w:p>
+            <w:pPr>
+              <w:spacing w:after="40" w:lineRule="auto"/>
+              <w:rPr>
+                <w:b w:val="1"/>
+                <w:bCs w:val="1"/>
+                <w:color w:val="1f2937"/>
+                <w:sz w:val="19"/>
+                <w:szCs w:val="19"/>
+              </w:rPr>
+            </w:pPr>
+            <w:r>
+              <w:rPr>
+                <w:b w:val="1"/>
+                <w:bCs w:val="1"/>
+                <w:color w:val="0f5b66"/>
+                <w:sz w:val="17"/>
+                <w:szCs w:val="17"/>
+                <w:rtl w:val="0"/>
+              </w:rPr>
+              <w:t>H16 / EVACUATION_PLAN_TESTED</w:t>
+              <w:br/>
+            </w:r>
+            <w:r>
+              <w:rPr>
+                <w:b w:val="1"/>
+                <w:bCs w:val="1"/>
+                <w:color w:val="1f2937"/>
+                <w:sz w:val="19"/>
+                <w:szCs w:val="19"/>
+                <w:rtl w:val="0"/>
+              </w:rPr>
+              <w:t>Has the evacuation plan been tested, rehearsed or formally checked?</w:t>
+            </w:r>
+          </w:p>
+          <w:p>
+            <w:pPr>
+              <w:spacing w:before="40" w:lineRule="auto"/>
+              <w:rPr>
+                <w:b w:val="1"/>
+                <w:bCs w:val="1"/>
+                <w:i w:val="1"/>
+                <w:iCs w:val="1"/>
+                <w:color w:val="6b7280"/>
+                <w:sz w:val="16"/>
+                <w:szCs w:val="16"/>
+              </w:rPr>
+            </w:pPr>
+            <w:r>
+              <w:rPr>
+                <w:b w:val="1"/>
+                <w:bCs w:val="1"/>
+                <w:i w:val="1"/>
+                <w:iCs w:val="1"/>
+                <w:color w:val="6b7280"/>
+                <w:sz w:val="16"/>
+                <w:szCs w:val="16"/>
+                <w:rtl w:val="0"/>
+              </w:rPr>
+              <w:t>Response format: Enter exactly Yes or No</w:t>
+            </w:r>
+          </w:p>
+        </w:tc>
+        <w:tc>
+          <w:tcPr>
+            <w:tcBorders>
+              <w:top w:color="0f5b66" w:space="0" w:sz="8" w:val="single"/>
+              <w:left w:color="0f5b66" w:space="0" w:sz="8" w:val="single"/>
+              <w:bottom w:color="0f5b66" w:space="0" w:sz="8" w:val="single"/>
+              <w:right w:color="0f5b66" w:space="0" w:sz="8" w:val="single"/>
+            </w:tcBorders>
+            <w:shd w:fill="ffffff" w:val="clear"/>
+            <w:tcMar>
+              <w:top w:w="80.0" w:type="dxa"/>
+              <w:left w:w="140.0" w:type="dxa"/>
+              <w:bottom w:w="80.0" w:type="dxa"/>
+              <w:right w:w="80.0" w:type="dxa"/>
+            </w:tcMar>
+            <w:vAlign w:val="top"/>
+          </w:tcPr>
+          <w:p>
+            <w:pPr>
+              <w:rPr>
+                <w:b w:val="1"/>
+                <w:bCs w:val="1"/>
+                <w:i w:val="1"/>
+                <w:iCs w:val="1"/>
+                <w:color w:val="5f6368"/>
+                <w:sz w:val="20"/>
+                <w:szCs w:val="20"/>
+              </w:rPr>
+            </w:pPr>
+            <w:r>
+              <w:rPr>
+                <w:b w:val="1"/>
+                <w:bCs w:val="1"/>
+                <w:i w:val="1"/>
+                <w:iCs w:val="1"/>
+                <w:color w:val="5f6368"/>
+                <w:sz w:val="20"/>
+                <w:szCs w:val="20"/>
+                <w:rtl w:val="0"/>
+              </w:rPr>
+              <w:t>[Yes / No]</w:t>
+            </w:r>
+          </w:p>
+        </w:tc>
+      </w:tr>
+      <w:tr>
+        <w:trPr>
+          <w:cantSplit w:val="1"/>
+          <w:trHeight w:val="1005" w:hRule="atLeast"/>
+          <w:tblHeader w:val="0"/>
+        </w:trPr>
+        <w:tc>
+          <w:tcPr>
+            <w:tcBorders>
+              <w:top w:color="0f5b66" w:space="0" w:sz="8" w:val="single"/>
+              <w:left w:color="0f5b66" w:space="0" w:sz="8" w:val="single"/>
+              <w:bottom w:color="0f5b66" w:space="0" w:sz="8" w:val="single"/>
+              <w:right w:color="0f5b66" w:space="0" w:sz="8" w:val="single"/>
+            </w:tcBorders>
+            <w:shd w:fill="f4f7f8" w:val="clear"/>
+            <w:tcMar>
+              <w:top w:w="80.0" w:type="dxa"/>
+              <w:left w:w="80.0" w:type="dxa"/>
+              <w:bottom w:w="80.0" w:type="dxa"/>
+              <w:right w:w="180.0" w:type="dxa"/>
+            </w:tcMar>
+            <w:vAlign w:val="top"/>
+          </w:tcPr>
+          <w:p>
+            <w:pPr>
+              <w:spacing w:after="40" w:lineRule="auto"/>
+              <w:rPr>
+                <w:b w:val="1"/>
+                <w:bCs w:val="1"/>
+                <w:color w:val="1f2937"/>
+                <w:sz w:val="19"/>
+                <w:szCs w:val="19"/>
+              </w:rPr>
+            </w:pPr>
+            <w:r>
+              <w:rPr>
+                <w:b w:val="1"/>
+                <w:bCs w:val="1"/>
+                <w:color w:val="0f5b66"/>
+                <w:sz w:val="17"/>
+                <w:szCs w:val="17"/>
+                <w:rtl w:val="0"/>
+              </w:rPr>
+              <w:t>H17 / AUTHORITY_COORDINATION_CONFIRMED</w:t>
+              <w:br/>
+            </w:r>
+            <w:r>
+              <w:rPr>
+                <w:b w:val="1"/>
+                <w:bCs w:val="1"/>
+                <w:color w:val="1f2937"/>
+                <w:sz w:val="19"/>
+                <w:szCs w:val="19"/>
+                <w:rtl w:val="0"/>
+              </w:rPr>
+              <w:t>Has coordination with every required authority already been confirmed?</w:t>
+            </w:r>
+          </w:p>
+          <w:p>
+            <w:pPr>
+              <w:spacing w:before="40" w:lineRule="auto"/>
+              <w:rPr>
+                <w:b w:val="1"/>
+                <w:bCs w:val="1"/>
+                <w:i w:val="1"/>
+                <w:iCs w:val="1"/>
+                <w:color w:val="6b7280"/>
+                <w:sz w:val="16"/>
+                <w:szCs w:val="16"/>
+              </w:rPr>
+            </w:pPr>
+            <w:r>
+              <w:rPr>
+                <w:b w:val="1"/>
+                <w:bCs w:val="1"/>
+                <w:i w:val="1"/>
+                <w:iCs w:val="1"/>
+                <w:color w:val="6b7280"/>
+                <w:sz w:val="16"/>
+                <w:szCs w:val="16"/>
+                <w:rtl w:val="0"/>
+              </w:rPr>
+              <w:t>Response format: Enter exactly Yes or No</w:t>
+            </w:r>
+          </w:p>
+        </w:tc>
+        <w:tc>
+          <w:tcPr>
+            <w:tcBorders>
+              <w:top w:color="0f5b66" w:space="0" w:sz="8" w:val="single"/>
+              <w:left w:color="0f5b66" w:space="0" w:sz="8" w:val="single"/>
+              <w:bottom w:color="0f5b66" w:space="0" w:sz="8" w:val="single"/>
+              <w:right w:color="0f5b66" w:space="0" w:sz="8" w:val="single"/>
+            </w:tcBorders>
+            <w:shd w:fill="ffffff" w:val="clear"/>
+            <w:tcMar>
+              <w:top w:w="80.0" w:type="dxa"/>
+              <w:left w:w="140.0" w:type="dxa"/>
+              <w:bottom w:w="80.0" w:type="dxa"/>
+              <w:right w:w="80.0" w:type="dxa"/>
+            </w:tcMar>
+            <w:vAlign w:val="top"/>
+          </w:tcPr>
+          <w:p>
+            <w:pPr>
+              <w:rPr>
+                <w:b w:val="1"/>
+                <w:bCs w:val="1"/>
+                <w:i w:val="1"/>
+                <w:iCs w:val="1"/>
+                <w:color w:val="5f6368"/>
+                <w:sz w:val="20"/>
+                <w:szCs w:val="20"/>
+              </w:rPr>
+            </w:pPr>
+            <w:r>
+              <w:rPr>
+                <w:b w:val="1"/>
+                <w:bCs w:val="1"/>
+                <w:i w:val="1"/>
+                <w:iCs w:val="1"/>
+                <w:color w:val="5f6368"/>
+                <w:sz w:val="20"/>
+                <w:szCs w:val="20"/>
+                <w:rtl w:val="0"/>
+              </w:rPr>
+              <w:t>[Yes / No]</w:t>
+            </w:r>
+          </w:p>
+        </w:tc>
+      </w:tr>
+      <w:tr>
+        <w:trPr>
+          <w:cantSplit w:val="1"/>
+          <w:trHeight w:val="1005" w:hRule="atLeast"/>
+          <w:tblHeader w:val="0"/>
+        </w:trPr>
+        <w:tc>
+          <w:tcPr>
+            <w:tcBorders>
+              <w:top w:color="0f5b66" w:space="0" w:sz="8" w:val="single"/>
+              <w:left w:color="0f5b66" w:space="0" w:sz="8" w:val="single"/>
+              <w:bottom w:color="0f5b66" w:space="0" w:sz="8" w:val="single"/>
+              <w:right w:color="0f5b66" w:space="0" w:sz="8" w:val="single"/>
+            </w:tcBorders>
+            <w:shd w:fill="f4f7f8" w:val="clear"/>
+            <w:tcMar>
+              <w:top w:w="80.0" w:type="dxa"/>
+              <w:left w:w="80.0" w:type="dxa"/>
+              <w:bottom w:w="80.0" w:type="dxa"/>
+              <w:right w:w="180.0" w:type="dxa"/>
+            </w:tcMar>
+            <w:vAlign w:val="top"/>
+          </w:tcPr>
+          <w:p>
+            <w:pPr>
+              <w:spacing w:after="40" w:lineRule="auto"/>
+              <w:rPr>
+                <w:b w:val="1"/>
+                <w:bCs w:val="1"/>
+                <w:color w:val="1f2937"/>
+                <w:sz w:val="19"/>
+                <w:szCs w:val="19"/>
+              </w:rPr>
+            </w:pPr>
+            <w:r>
+              <w:rPr>
+                <w:b w:val="1"/>
+                <w:bCs w:val="1"/>
+                <w:color w:val="0f5b66"/>
+                <w:sz w:val="17"/>
+                <w:szCs w:val="17"/>
+                <w:rtl w:val="0"/>
+              </w:rPr>
+              <w:t>H18 / NEAREST_HOSPITAL_TRAVEL_MINUTES</w:t>
+              <w:br/>
+            </w:r>
+            <w:r>
+              <w:rPr>
+                <w:b w:val="1"/>
+                <w:bCs w:val="1"/>
+                <w:color w:val="1f2937"/>
+                <w:sz w:val="19"/>
+                <w:szCs w:val="19"/>
+                <w:rtl w:val="0"/>
+              </w:rPr>
+              <w:t>What is the estimated road travel time to the nearest suitable hospital?</w:t>
+            </w:r>
+          </w:p>
+          <w:p>
+            <w:pPr>
+              <w:spacing w:before="40" w:lineRule="auto"/>
+              <w:rPr>
+                <w:b w:val="1"/>
+                <w:bCs w:val="1"/>
+                <w:i w:val="1"/>
+                <w:iCs w:val="1"/>
+                <w:color w:val="6b7280"/>
+                <w:sz w:val="16"/>
+                <w:szCs w:val="16"/>
+              </w:rPr>
+            </w:pPr>
+            <w:r>
+              <w:rPr>
+                <w:b w:val="1"/>
+                <w:bCs w:val="1"/>
+                <w:i w:val="1"/>
+                <w:iCs w:val="1"/>
+                <w:color w:val="6b7280"/>
+                <w:sz w:val="16"/>
+                <w:szCs w:val="16"/>
+                <w:rtl w:val="0"/>
+              </w:rPr>
+              <w:t>Response format: Whole number of minutes from 0 to 240</w:t>
+            </w:r>
+          </w:p>
+        </w:tc>
+        <w:tc>
+          <w:tcPr>
+            <w:tcBorders>
+              <w:top w:color="0f5b66" w:space="0" w:sz="8" w:val="single"/>
+              <w:left w:color="0f5b66" w:space="0" w:sz="8" w:val="single"/>
+              <w:bottom w:color="0f5b66" w:space="0" w:sz="8" w:val="single"/>
+              <w:right w:color="0f5b66" w:space="0" w:sz="8" w:val="single"/>
+            </w:tcBorders>
+            <w:shd w:fill="ffffff" w:val="clear"/>
+            <w:tcMar>
+              <w:top w:w="80.0" w:type="dxa"/>
+              <w:left w:w="140.0" w:type="dxa"/>
+              <w:bottom w:w="80.0" w:type="dxa"/>
+              <w:right w:w="80.0" w:type="dxa"/>
+            </w:tcMar>
+            <w:vAlign w:val="top"/>
+          </w:tcPr>
+          <w:p>
+            <w:pPr>
+              <w:rPr>
+                <w:b w:val="1"/>
+                <w:bCs w:val="1"/>
+                <w:i w:val="1"/>
+                <w:iCs w:val="1"/>
+                <w:color w:val="5f6368"/>
+                <w:sz w:val="20"/>
+                <w:szCs w:val="20"/>
+              </w:rPr>
+            </w:pPr>
+            <w:r>
+              <w:rPr>
+                <w:b w:val="1"/>
+                <w:bCs w:val="1"/>
+                <w:i w:val="1"/>
+                <w:iCs w:val="1"/>
+                <w:color w:val="5f6368"/>
+                <w:sz w:val="20"/>
+                <w:szCs w:val="20"/>
+                <w:rtl w:val="0"/>
+              </w:rPr>
+              <w:t>[Enter whole minutes from 0 to 240]</w:t>
             </w:r>
           </w:p>
         </w:tc>

</xml_diff>